<commit_message>
Enhanced the notifications section and the document email sending functionalities
</commit_message>
<xml_diff>
--- a/cases/templates/acte/citatie_procuror_template.docx
+++ b/cases/templates/acte/citatie_procuror_template.docx
@@ -4,6 +4,8 @@
   <w:body>
     <w:p>
       <w:pPr>
+        <w:spacing w:line="240" w:lineRule="auto"/>
+        <w:jc w:val="both"/>
         <w:rPr>
           <w:rFonts w:ascii="Times New Roman" w:hAnsi="Times New Roman" w:cs="Times New Roman"/>
           <w:b/>
@@ -15,12 +17,55 @@
           <w:rFonts w:ascii="Times New Roman" w:hAnsi="Times New Roman" w:cs="Times New Roman"/>
           <w:b/>
           <w:bCs/>
-        </w:rPr>
-        <w:t>ANTET PARCHETUL DE PE LÂNGĂ JUDECĂTORIA XYZ</w:t>
+          <w:noProof/>
+        </w:rPr>
+        <w:drawing>
+          <wp:inline distT="0" distB="0" distL="0" distR="0" wp14:anchorId="5F3761F0" wp14:editId="278EBDBF">
+            <wp:extent cx="1004570" cy="669290"/>
+            <wp:effectExtent l="0" t="0" r="0" b="0"/>
+            <wp:docPr id="635756682" name="Picture 1"/>
+            <wp:cNvGraphicFramePr>
+              <a:graphicFrameLocks xmlns:a="http://schemas.openxmlformats.org/drawingml/2006/main" noChangeAspect="1"/>
+            </wp:cNvGraphicFramePr>
+            <a:graphic xmlns:a="http://schemas.openxmlformats.org/drawingml/2006/main">
+              <a:graphicData uri="http://schemas.openxmlformats.org/drawingml/2006/picture">
+                <pic:pic xmlns:pic="http://schemas.openxmlformats.org/drawingml/2006/picture">
+                  <pic:nvPicPr>
+                    <pic:cNvPr id="635756682" name="Picture 635756682"/>
+                    <pic:cNvPicPr/>
+                  </pic:nvPicPr>
+                  <pic:blipFill>
+                    <a:blip r:embed="rId6" cstate="print">
+                      <a:extLst>
+                        <a:ext uri="{28A0092B-C50C-407E-A947-70E740481C1C}">
+                          <a14:useLocalDpi xmlns:a14="http://schemas.microsoft.com/office/drawing/2010/main" val="0"/>
+                        </a:ext>
+                      </a:extLst>
+                    </a:blip>
+                    <a:stretch>
+                      <a:fillRect/>
+                    </a:stretch>
+                  </pic:blipFill>
+                  <pic:spPr>
+                    <a:xfrm>
+                      <a:off x="0" y="0"/>
+                      <a:ext cx="1004570" cy="669290"/>
+                    </a:xfrm>
+                    <a:prstGeom prst="rect">
+                      <a:avLst/>
+                    </a:prstGeom>
+                  </pic:spPr>
+                </pic:pic>
+              </a:graphicData>
+            </a:graphic>
+          </wp:inline>
+        </w:drawing>
       </w:r>
     </w:p>
     <w:p>
       <w:pPr>
+        <w:spacing w:line="240" w:lineRule="auto"/>
+        <w:jc w:val="both"/>
         <w:rPr>
           <w:rFonts w:ascii="Times New Roman" w:hAnsi="Times New Roman" w:cs="Times New Roman"/>
           <w:b/>
@@ -30,12 +75,191 @@
     </w:p>
     <w:p>
       <w:pPr>
-        <w:rPr>
-          <w:rFonts w:ascii="Times New Roman" w:hAnsi="Times New Roman" w:cs="Times New Roman"/>
-          <w:b/>
-          <w:bCs/>
-        </w:rPr>
+        <w:spacing w:line="240" w:lineRule="auto"/>
+        <w:jc w:val="both"/>
+        <w:rPr>
+          <w:rFonts w:ascii="Times New Roman" w:hAnsi="Times New Roman" w:cs="Times New Roman"/>
+          <w:b/>
+          <w:bCs/>
+        </w:rPr>
+        <w:sectPr>
+          <w:pgSz w:w="12240" w:h="15840"/>
+          <w:pgMar w:top="1440" w:right="1440" w:bottom="1440" w:left="1440" w:header="720" w:footer="720" w:gutter="0"/>
+          <w:cols w:num="2" w:space="170" w:equalWidth="0">
+            <w:col w:w="1582" w:space="170"/>
+            <w:col w:w="7608"/>
+          </w:cols>
+          <w:docGrid w:linePitch="360"/>
+        </w:sectPr>
       </w:pPr>
+      <w:r>
+        <w:rPr>
+          <w:rFonts w:ascii="Times New Roman" w:hAnsi="Times New Roman" w:cs="Times New Roman"/>
+          <w:b/>
+          <w:bCs/>
+        </w:rPr>
+        <w:t>PARCHETUL DE PE LÂNGĂ JUDECĂTORIA DOBÂRLĂU</w:t>
+      </w:r>
+    </w:p>
+    <w:p>
+      <w:pPr>
+        <w:spacing w:line="240" w:lineRule="auto"/>
+        <w:jc w:val="both"/>
+        <w:rPr>
+          <w:rFonts w:ascii="Times New Roman" w:hAnsi="Times New Roman" w:cs="Times New Roman"/>
+          <w:b/>
+          <w:bCs/>
+        </w:rPr>
+      </w:pPr>
+      <w:r>
+        <w:rPr>
+          <w:rFonts w:ascii="Times New Roman" w:hAnsi="Times New Roman" w:cs="Times New Roman"/>
+          <w:b/>
+          <w:bCs/>
+          <w:noProof/>
+        </w:rPr>
+        <mc:AlternateContent>
+          <mc:Choice Requires="wps">
+            <w:drawing>
+              <wp:anchor distT="0" distB="0" distL="114300" distR="114300" simplePos="0" relativeHeight="251659264" behindDoc="0" locked="0" layoutInCell="1" allowOverlap="1" wp14:anchorId="2785EF20" wp14:editId="7F143AF1">
+                <wp:simplePos x="0" y="0"/>
+                <wp:positionH relativeFrom="column">
+                  <wp:posOffset>120015</wp:posOffset>
+                </wp:positionH>
+                <wp:positionV relativeFrom="paragraph">
+                  <wp:posOffset>6985</wp:posOffset>
+                </wp:positionV>
+                <wp:extent cx="6225540" cy="7620"/>
+                <wp:effectExtent l="0" t="0" r="22860" b="30480"/>
+                <wp:wrapNone/>
+                <wp:docPr id="1860019955" name="Straight Connector 2"/>
+                <wp:cNvGraphicFramePr/>
+                <a:graphic xmlns:a="http://schemas.openxmlformats.org/drawingml/2006/main">
+                  <a:graphicData uri="http://schemas.microsoft.com/office/word/2010/wordprocessingShape">
+                    <wps:wsp>
+                      <wps:cNvCnPr/>
+                      <wps:spPr>
+                        <a:xfrm>
+                          <a:off x="0" y="0"/>
+                          <a:ext cx="6225540" cy="7620"/>
+                        </a:xfrm>
+                        <a:prstGeom prst="line">
+                          <a:avLst/>
+                        </a:prstGeom>
+                      </wps:spPr>
+                      <wps:style>
+                        <a:lnRef idx="2">
+                          <a:schemeClr val="accent1"/>
+                        </a:lnRef>
+                        <a:fillRef idx="0">
+                          <a:schemeClr val="accent1"/>
+                        </a:fillRef>
+                        <a:effectRef idx="1">
+                          <a:schemeClr val="accent1"/>
+                        </a:effectRef>
+                        <a:fontRef idx="minor">
+                          <a:schemeClr val="tx1"/>
+                        </a:fontRef>
+                      </wps:style>
+                      <wps:bodyPr/>
+                    </wps:wsp>
+                  </a:graphicData>
+                </a:graphic>
+              </wp:anchor>
+            </w:drawing>
+          </mc:Choice>
+          <mc:Fallback>
+            <w:pict>
+              <v:line w14:anchorId="0BFC20BA" id="Straight Connector 2" o:spid="_x0000_s1026" style="position:absolute;z-index:251659264;visibility:visible;mso-wrap-style:square;mso-wrap-distance-left:9pt;mso-wrap-distance-top:0;mso-wrap-distance-right:9pt;mso-wrap-distance-bottom:0;mso-position-horizontal:absolute;mso-position-horizontal-relative:text;mso-position-vertical:absolute;mso-position-vertical-relative:text" from="9.45pt,.55pt" to="499.65pt,1.15pt" o:gfxdata="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" strokecolor="#156082 [3204]" strokeweight="1.5pt">
+                <v:stroke joinstyle="miter"/>
+              </v:line>
+            </w:pict>
+          </mc:Fallback>
+        </mc:AlternateContent>
+      </w:r>
+    </w:p>
+    <w:p>
+      <w:pPr>
+        <w:spacing w:line="240" w:lineRule="auto"/>
+        <w:jc w:val="both"/>
+        <w:rPr>
+          <w:rFonts w:ascii="Times New Roman" w:hAnsi="Times New Roman" w:cs="Times New Roman"/>
+          <w:b/>
+          <w:bCs/>
+        </w:rPr>
+      </w:pPr>
+      <w:proofErr w:type="spellStart"/>
+      <w:r>
+        <w:rPr>
+          <w:rFonts w:ascii="Times New Roman" w:hAnsi="Times New Roman" w:cs="Times New Roman"/>
+          <w:b/>
+          <w:bCs/>
+        </w:rPr>
+        <w:t>Dosar</w:t>
+      </w:r>
+      <w:proofErr w:type="spellEnd"/>
+      <w:r>
+        <w:rPr>
+          <w:rFonts w:ascii="Times New Roman" w:hAnsi="Times New Roman" w:cs="Times New Roman"/>
+          <w:b/>
+          <w:bCs/>
+        </w:rPr>
+        <w:t xml:space="preserve"> nr. </w:t>
+      </w:r>
+      <w:proofErr w:type="gramStart"/>
+      <w:r>
+        <w:rPr>
+          <w:rFonts w:ascii="Times New Roman" w:hAnsi="Times New Roman" w:cs="Times New Roman"/>
+          <w:b/>
+          <w:bCs/>
+        </w:rPr>
+        <w:t xml:space="preserve">{{ </w:t>
+      </w:r>
+      <w:proofErr w:type="spellStart"/>
+      <w:r>
+        <w:rPr>
+          <w:rFonts w:ascii="Times New Roman" w:hAnsi="Times New Roman" w:cs="Times New Roman"/>
+          <w:b/>
+          <w:bCs/>
+        </w:rPr>
+        <w:t>numar</w:t>
+      </w:r>
+      <w:proofErr w:type="gramEnd"/>
+      <w:r>
+        <w:rPr>
+          <w:rFonts w:ascii="Times New Roman" w:hAnsi="Times New Roman" w:cs="Times New Roman"/>
+          <w:b/>
+          <w:bCs/>
+        </w:rPr>
+        <w:t>_</w:t>
+      </w:r>
+      <w:proofErr w:type="gramStart"/>
+      <w:r>
+        <w:rPr>
+          <w:rFonts w:ascii="Times New Roman" w:hAnsi="Times New Roman" w:cs="Times New Roman"/>
+          <w:b/>
+          <w:bCs/>
+        </w:rPr>
+        <w:t>dosar</w:t>
+      </w:r>
+      <w:proofErr w:type="spellEnd"/>
+      <w:r>
+        <w:rPr>
+          <w:rFonts w:ascii="Times New Roman" w:hAnsi="Times New Roman" w:cs="Times New Roman"/>
+          <w:b/>
+          <w:bCs/>
+        </w:rPr>
+        <w:t xml:space="preserve"> }</w:t>
+      </w:r>
+      <w:proofErr w:type="gramEnd"/>
+      <w:r>
+        <w:rPr>
+          <w:rFonts w:ascii="Times New Roman" w:hAnsi="Times New Roman" w:cs="Times New Roman"/>
+          <w:b/>
+          <w:bCs/>
+        </w:rPr>
+        <w:t>}</w:t>
+      </w:r>
     </w:p>
     <w:p>
       <w:pPr>
@@ -75,6 +299,89 @@
     </w:p>
     <w:p>
       <w:pPr>
+        <w:spacing w:line="240" w:lineRule="auto"/>
+        <w:jc w:val="center"/>
+        <w:rPr>
+          <w:rFonts w:ascii="Times New Roman" w:hAnsi="Times New Roman" w:cs="Times New Roman"/>
+          <w:b/>
+          <w:bCs/>
+        </w:rPr>
+      </w:pPr>
+      <w:proofErr w:type="spellStart"/>
+      <w:r>
+        <w:rPr>
+          <w:rFonts w:ascii="Times New Roman" w:hAnsi="Times New Roman" w:cs="Times New Roman"/>
+          <w:b/>
+          <w:bCs/>
+        </w:rPr>
+        <w:t>emisă</w:t>
+      </w:r>
+      <w:proofErr w:type="spellEnd"/>
+      <w:r>
+        <w:rPr>
+          <w:rFonts w:ascii="Times New Roman" w:hAnsi="Times New Roman" w:cs="Times New Roman"/>
+          <w:b/>
+          <w:bCs/>
+        </w:rPr>
+        <w:t xml:space="preserve"> la </w:t>
+      </w:r>
+      <w:proofErr w:type="gramStart"/>
+      <w:r>
+        <w:rPr>
+          <w:rFonts w:ascii="Times New Roman" w:hAnsi="Times New Roman" w:cs="Times New Roman"/>
+          <w:b/>
+          <w:bCs/>
+        </w:rPr>
+        <w:t xml:space="preserve">{{ </w:t>
+      </w:r>
+      <w:proofErr w:type="spellStart"/>
+      <w:r>
+        <w:rPr>
+          <w:rFonts w:ascii="Times New Roman" w:hAnsi="Times New Roman" w:cs="Times New Roman"/>
+          <w:b/>
+          <w:bCs/>
+        </w:rPr>
+        <w:t>data</w:t>
+      </w:r>
+      <w:proofErr w:type="gramEnd"/>
+      <w:r>
+        <w:rPr>
+          <w:rFonts w:ascii="Times New Roman" w:hAnsi="Times New Roman" w:cs="Times New Roman"/>
+          <w:b/>
+          <w:bCs/>
+        </w:rPr>
+        <w:t>_</w:t>
+      </w:r>
+      <w:proofErr w:type="gramStart"/>
+      <w:r>
+        <w:rPr>
+          <w:rFonts w:ascii="Times New Roman" w:hAnsi="Times New Roman" w:cs="Times New Roman"/>
+          <w:b/>
+          <w:bCs/>
+        </w:rPr>
+        <w:t>actului</w:t>
+      </w:r>
+      <w:proofErr w:type="spellEnd"/>
+      <w:r>
+        <w:rPr>
+          <w:rFonts w:ascii="Times New Roman" w:hAnsi="Times New Roman" w:cs="Times New Roman"/>
+          <w:b/>
+          <w:bCs/>
+        </w:rPr>
+        <w:t xml:space="preserve"> }</w:t>
+      </w:r>
+      <w:proofErr w:type="gramEnd"/>
+      <w:r>
+        <w:rPr>
+          <w:rFonts w:ascii="Times New Roman" w:hAnsi="Times New Roman" w:cs="Times New Roman"/>
+          <w:b/>
+          <w:bCs/>
+        </w:rPr>
+        <w:t>}</w:t>
+      </w:r>
+    </w:p>
+    <w:p>
+      <w:pPr>
         <w:jc w:val="center"/>
         <w:rPr>
           <w:rFonts w:ascii="Times New Roman" w:hAnsi="Times New Roman" w:cs="Times New Roman"/>
@@ -86,6 +393,7 @@
     <w:p>
       <w:pPr>
         <w:ind w:firstLine="720"/>
+        <w:jc w:val="both"/>
         <w:rPr>
           <w:rFonts w:ascii="Times New Roman" w:hAnsi="Times New Roman" w:cs="Times New Roman"/>
         </w:rPr>
@@ -94,19 +402,15 @@
       <w:r>
         <w:rPr>
           <w:rFonts w:ascii="Times New Roman" w:hAnsi="Times New Roman" w:cs="Times New Roman"/>
-          <w:b/>
-          <w:bCs/>
-        </w:rPr>
-        <w:t>Procuror</w:t>
-      </w:r>
-      <w:proofErr w:type="spellEnd"/>
-      <w:r>
-        <w:rPr>
-          <w:rFonts w:ascii="Times New Roman" w:hAnsi="Times New Roman" w:cs="Times New Roman"/>
-          <w:b/>
-          <w:bCs/>
-        </w:rPr>
-        <w:t xml:space="preserve"> </w:t>
+        </w:rPr>
+        <w:t>Numitul</w:t>
+      </w:r>
+      <w:proofErr w:type="spellEnd"/>
+      <w:r>
+        <w:rPr>
+          <w:rFonts w:ascii="Times New Roman" w:hAnsi="Times New Roman" w:cs="Times New Roman"/>
+        </w:rPr>
+        <w:t xml:space="preserve">/a </w:t>
       </w:r>
       <w:proofErr w:type="gramStart"/>
       <w:r>
@@ -142,7 +446,7 @@
           <w:b/>
           <w:bCs/>
         </w:rPr>
-        <w:t>semnatar</w:t>
+        <w:t>persoana</w:t>
       </w:r>
       <w:proofErr w:type="spellEnd"/>
       <w:r>
@@ -160,25 +464,293 @@
           <w:b/>
           <w:bCs/>
         </w:rPr>
+        <w:t xml:space="preserve">}, cu </w:t>
+      </w:r>
+      <w:proofErr w:type="spellStart"/>
+      <w:r>
+        <w:rPr>
+          <w:rFonts w:ascii="Times New Roman" w:hAnsi="Times New Roman" w:cs="Times New Roman"/>
+          <w:b/>
+          <w:bCs/>
+        </w:rPr>
+        <w:t>domiciliul</w:t>
+      </w:r>
+      <w:proofErr w:type="spellEnd"/>
+      <w:r>
+        <w:rPr>
+          <w:rFonts w:ascii="Times New Roman" w:hAnsi="Times New Roman" w:cs="Times New Roman"/>
+          <w:b/>
+          <w:bCs/>
+        </w:rPr>
+        <w:t xml:space="preserve"> </w:t>
+      </w:r>
+      <w:proofErr w:type="spellStart"/>
+      <w:r>
+        <w:rPr>
+          <w:rFonts w:ascii="Times New Roman" w:hAnsi="Times New Roman" w:cs="Times New Roman"/>
+          <w:b/>
+          <w:bCs/>
+        </w:rPr>
+        <w:t>în</w:t>
+      </w:r>
+      <w:proofErr w:type="spellEnd"/>
+      <w:r>
+        <w:rPr>
+          <w:rFonts w:ascii="Times New Roman" w:hAnsi="Times New Roman" w:cs="Times New Roman"/>
+          <w:b/>
+          <w:bCs/>
+        </w:rPr>
+        <w:t xml:space="preserve"> </w:t>
+      </w:r>
+      <w:proofErr w:type="gramStart"/>
+      <w:r>
+        <w:rPr>
+          <w:rFonts w:ascii="Times New Roman" w:hAnsi="Times New Roman" w:cs="Times New Roman"/>
+          <w:b/>
+          <w:bCs/>
+        </w:rPr>
+        <w:t xml:space="preserve">{{ </w:t>
+      </w:r>
+      <w:proofErr w:type="spellStart"/>
+      <w:r>
+        <w:rPr>
+          <w:rFonts w:ascii="Times New Roman" w:hAnsi="Times New Roman" w:cs="Times New Roman"/>
+          <w:b/>
+          <w:bCs/>
+        </w:rPr>
+        <w:t>adresa</w:t>
+      </w:r>
+      <w:proofErr w:type="spellEnd"/>
+      <w:proofErr w:type="gramEnd"/>
+      <w:r>
+        <w:rPr>
+          <w:rFonts w:ascii="Times New Roman" w:hAnsi="Times New Roman" w:cs="Times New Roman"/>
+          <w:b/>
+          <w:bCs/>
+        </w:rPr>
+        <w:t xml:space="preserve"> }}, </w:t>
+      </w:r>
+      <w:proofErr w:type="spellStart"/>
+      <w:r>
+        <w:rPr>
+          <w:rFonts w:ascii="Times New Roman" w:hAnsi="Times New Roman" w:cs="Times New Roman"/>
+        </w:rPr>
+        <w:t>este</w:t>
+      </w:r>
+      <w:proofErr w:type="spellEnd"/>
+      <w:r>
+        <w:rPr>
+          <w:rFonts w:ascii="Times New Roman" w:hAnsi="Times New Roman" w:cs="Times New Roman"/>
+        </w:rPr>
+        <w:t xml:space="preserve"> </w:t>
+      </w:r>
+      <w:proofErr w:type="spellStart"/>
+      <w:r>
+        <w:rPr>
+          <w:rFonts w:ascii="Times New Roman" w:hAnsi="Times New Roman" w:cs="Times New Roman"/>
+        </w:rPr>
+        <w:t>chemat</w:t>
+      </w:r>
+      <w:proofErr w:type="spellEnd"/>
+      <w:r>
+        <w:rPr>
+          <w:rFonts w:ascii="Times New Roman" w:hAnsi="Times New Roman" w:cs="Times New Roman"/>
+        </w:rPr>
+        <w:t>/ă</w:t>
+      </w:r>
+      <w:r>
+        <w:rPr>
+          <w:rFonts w:ascii="Times New Roman" w:hAnsi="Times New Roman" w:cs="Times New Roman"/>
+        </w:rPr>
+        <w:t xml:space="preserve"> la </w:t>
+      </w:r>
+      <w:proofErr w:type="spellStart"/>
+      <w:r>
+        <w:rPr>
+          <w:rFonts w:ascii="Times New Roman" w:hAnsi="Times New Roman" w:cs="Times New Roman"/>
+        </w:rPr>
+        <w:t>acest</w:t>
+      </w:r>
+      <w:proofErr w:type="spellEnd"/>
+      <w:r>
+        <w:rPr>
+          <w:rFonts w:ascii="Times New Roman" w:hAnsi="Times New Roman" w:cs="Times New Roman"/>
+        </w:rPr>
+        <w:t xml:space="preserve"> </w:t>
+      </w:r>
+      <w:proofErr w:type="spellStart"/>
+      <w:r>
+        <w:rPr>
+          <w:rFonts w:ascii="Times New Roman" w:hAnsi="Times New Roman" w:cs="Times New Roman"/>
+        </w:rPr>
+        <w:t>parchet</w:t>
+      </w:r>
+      <w:proofErr w:type="spellEnd"/>
+      <w:r>
+        <w:rPr>
+          <w:rFonts w:ascii="Times New Roman" w:hAnsi="Times New Roman" w:cs="Times New Roman"/>
+        </w:rPr>
+        <w:t xml:space="preserve"> </w:t>
+      </w:r>
+      <w:proofErr w:type="spellStart"/>
+      <w:r>
+        <w:rPr>
+          <w:rFonts w:ascii="Times New Roman" w:hAnsi="Times New Roman" w:cs="Times New Roman"/>
+        </w:rPr>
+        <w:t>pentru</w:t>
+      </w:r>
+      <w:proofErr w:type="spellEnd"/>
+      <w:r>
+        <w:rPr>
+          <w:rFonts w:ascii="Times New Roman" w:hAnsi="Times New Roman" w:cs="Times New Roman"/>
+        </w:rPr>
+        <w:t xml:space="preserve"> </w:t>
+      </w:r>
+      <w:proofErr w:type="gramStart"/>
+      <w:r>
+        <w:rPr>
+          <w:rFonts w:ascii="Times New Roman" w:hAnsi="Times New Roman" w:cs="Times New Roman"/>
+          <w:b/>
+          <w:bCs/>
+        </w:rPr>
+        <w:t xml:space="preserve">{{ </w:t>
+      </w:r>
+      <w:proofErr w:type="spellStart"/>
+      <w:r>
+        <w:rPr>
+          <w:rFonts w:ascii="Times New Roman" w:hAnsi="Times New Roman" w:cs="Times New Roman"/>
+          <w:b/>
+          <w:bCs/>
+        </w:rPr>
+        <w:t>data</w:t>
+      </w:r>
+      <w:proofErr w:type="gramEnd"/>
+      <w:r>
+        <w:rPr>
+          <w:rFonts w:ascii="Times New Roman" w:hAnsi="Times New Roman" w:cs="Times New Roman"/>
+          <w:b/>
+          <w:bCs/>
+        </w:rPr>
+        <w:t>_</w:t>
+      </w:r>
+      <w:proofErr w:type="gramStart"/>
+      <w:r>
+        <w:rPr>
+          <w:rFonts w:ascii="Times New Roman" w:hAnsi="Times New Roman" w:cs="Times New Roman"/>
+          <w:b/>
+          <w:bCs/>
+        </w:rPr>
+        <w:t>ora</w:t>
+      </w:r>
+      <w:proofErr w:type="spellEnd"/>
+      <w:r>
+        <w:rPr>
+          <w:rFonts w:ascii="Times New Roman" w:hAnsi="Times New Roman" w:cs="Times New Roman"/>
+          <w:b/>
+          <w:bCs/>
+        </w:rPr>
+        <w:t xml:space="preserve"> </w:t>
+      </w:r>
+      <w:r>
+        <w:rPr>
+          <w:rFonts w:ascii="Times New Roman" w:hAnsi="Times New Roman" w:cs="Times New Roman"/>
+        </w:rPr>
         <w:t>}</w:t>
       </w:r>
-      <w:r>
-        <w:rPr>
-          <w:rFonts w:ascii="Times New Roman" w:hAnsi="Times New Roman" w:cs="Times New Roman"/>
-        </w:rPr>
-        <w:t xml:space="preserve"> din </w:t>
-      </w:r>
-      <w:proofErr w:type="spellStart"/>
-      <w:r>
-        <w:rPr>
-          <w:rFonts w:ascii="Times New Roman" w:hAnsi="Times New Roman" w:cs="Times New Roman"/>
-        </w:rPr>
-        <w:t>cadrul</w:t>
-      </w:r>
-      <w:proofErr w:type="spellEnd"/>
-      <w:r>
-        <w:rPr>
-          <w:rFonts w:ascii="Times New Roman" w:hAnsi="Times New Roman" w:cs="Times New Roman"/>
+      <w:proofErr w:type="gramEnd"/>
+      <w:r>
+        <w:rPr>
+          <w:rFonts w:ascii="Times New Roman" w:hAnsi="Times New Roman" w:cs="Times New Roman"/>
+        </w:rPr>
+        <w:t>}</w:t>
+      </w:r>
+      <w:r>
+        <w:rPr>
+          <w:rFonts w:ascii="Times New Roman" w:hAnsi="Times New Roman" w:cs="Times New Roman"/>
+        </w:rPr>
+        <w:t>,</w:t>
+      </w:r>
+      <w:r>
+        <w:rPr>
+          <w:rFonts w:ascii="Times New Roman" w:hAnsi="Times New Roman" w:cs="Times New Roman"/>
+        </w:rPr>
+        <w:t xml:space="preserve"> </w:t>
+      </w:r>
+      <w:proofErr w:type="spellStart"/>
+      <w:r>
+        <w:rPr>
+          <w:rFonts w:ascii="Times New Roman" w:hAnsi="Times New Roman" w:cs="Times New Roman"/>
+        </w:rPr>
+        <w:t>în</w:t>
+      </w:r>
+      <w:proofErr w:type="spellEnd"/>
+      <w:r>
+        <w:rPr>
+          <w:rFonts w:ascii="Times New Roman" w:hAnsi="Times New Roman" w:cs="Times New Roman"/>
+        </w:rPr>
+        <w:t xml:space="preserve"> </w:t>
+      </w:r>
+      <w:proofErr w:type="spellStart"/>
+      <w:r>
+        <w:rPr>
+          <w:rFonts w:ascii="Times New Roman" w:hAnsi="Times New Roman" w:cs="Times New Roman"/>
+        </w:rPr>
+        <w:t>vederea</w:t>
+      </w:r>
+      <w:proofErr w:type="spellEnd"/>
+      <w:r>
+        <w:rPr>
+          <w:rFonts w:ascii="Times New Roman" w:hAnsi="Times New Roman" w:cs="Times New Roman"/>
+        </w:rPr>
+        <w:t xml:space="preserve"> </w:t>
+      </w:r>
+      <w:proofErr w:type="spellStart"/>
+      <w:r>
+        <w:rPr>
+          <w:rFonts w:ascii="Times New Roman" w:hAnsi="Times New Roman" w:cs="Times New Roman"/>
+        </w:rPr>
+        <w:t>audierii</w:t>
+      </w:r>
+      <w:proofErr w:type="spellEnd"/>
+      <w:r>
+        <w:rPr>
+          <w:rFonts w:ascii="Times New Roman" w:hAnsi="Times New Roman" w:cs="Times New Roman"/>
+        </w:rPr>
+        <w:t xml:space="preserve"> </w:t>
+      </w:r>
+      <w:proofErr w:type="spellStart"/>
+      <w:r>
+        <w:rPr>
+          <w:rFonts w:ascii="Times New Roman" w:hAnsi="Times New Roman" w:cs="Times New Roman"/>
+        </w:rPr>
+        <w:t>în</w:t>
+      </w:r>
+      <w:proofErr w:type="spellEnd"/>
+      <w:r>
+        <w:rPr>
+          <w:rFonts w:ascii="Times New Roman" w:hAnsi="Times New Roman" w:cs="Times New Roman"/>
+        </w:rPr>
+        <w:t xml:space="preserve"> </w:t>
+      </w:r>
+      <w:proofErr w:type="spellStart"/>
+      <w:r>
+        <w:rPr>
+          <w:rFonts w:ascii="Times New Roman" w:hAnsi="Times New Roman" w:cs="Times New Roman"/>
+        </w:rPr>
+        <w:t>calitate</w:t>
+      </w:r>
+      <w:proofErr w:type="spellEnd"/>
+      <w:r>
+        <w:rPr>
+          <w:rFonts w:ascii="Times New Roman" w:hAnsi="Times New Roman" w:cs="Times New Roman"/>
+        </w:rPr>
+        <w:t xml:space="preserve"> de</w:t>
+      </w:r>
+      <w:r>
+        <w:rPr>
+          <w:rFonts w:ascii="Times New Roman" w:hAnsi="Times New Roman" w:cs="Times New Roman"/>
+          <w:b/>
+          <w:bCs/>
         </w:rPr>
         <w:t xml:space="preserve"> </w:t>
       </w:r>
@@ -186,6 +758,8 @@
       <w:r>
         <w:rPr>
           <w:rFonts w:ascii="Times New Roman" w:hAnsi="Times New Roman" w:cs="Times New Roman"/>
+          <w:b/>
+          <w:bCs/>
         </w:rPr>
         <w:t xml:space="preserve">{{ </w:t>
       </w:r>
@@ -193,16 +767,20 @@
       <w:r>
         <w:rPr>
           <w:rFonts w:ascii="Times New Roman" w:hAnsi="Times New Roman" w:cs="Times New Roman"/>
-        </w:rPr>
-        <w:t>unitate</w:t>
+          <w:b/>
+          <w:bCs/>
+        </w:rPr>
+        <w:t>calitate</w:t>
       </w:r>
       <w:proofErr w:type="spellEnd"/>
       <w:proofErr w:type="gramEnd"/>
       <w:r>
         <w:rPr>
           <w:rFonts w:ascii="Times New Roman" w:hAnsi="Times New Roman" w:cs="Times New Roman"/>
-        </w:rPr>
-        <w:t xml:space="preserve"> }}, </w:t>
+          <w:b/>
+          <w:bCs/>
+        </w:rPr>
+        <w:t xml:space="preserve"> }} </w:t>
       </w:r>
       <w:proofErr w:type="spellStart"/>
       <w:r>
@@ -223,19 +801,63 @@
         <w:rPr>
           <w:rFonts w:ascii="Times New Roman" w:hAnsi="Times New Roman" w:cs="Times New Roman"/>
         </w:rPr>
-        <w:t>dosarul</w:t>
-      </w:r>
-      <w:proofErr w:type="spellEnd"/>
-      <w:r>
-        <w:rPr>
-          <w:rFonts w:ascii="Times New Roman" w:hAnsi="Times New Roman" w:cs="Times New Roman"/>
-        </w:rPr>
-        <w:t xml:space="preserve"> penal nr. </w:t>
+        <w:t>cauza</w:t>
+      </w:r>
+      <w:proofErr w:type="spellEnd"/>
+      <w:r>
+        <w:rPr>
+          <w:rFonts w:ascii="Times New Roman" w:hAnsi="Times New Roman" w:cs="Times New Roman"/>
+        </w:rPr>
+        <w:t xml:space="preserve"> </w:t>
+      </w:r>
+      <w:proofErr w:type="spellStart"/>
+      <w:r>
+        <w:rPr>
+          <w:rFonts w:ascii="Times New Roman" w:hAnsi="Times New Roman" w:cs="Times New Roman"/>
+        </w:rPr>
+        <w:t>privind</w:t>
+      </w:r>
+      <w:proofErr w:type="spellEnd"/>
+      <w:r>
+        <w:rPr>
+          <w:rFonts w:ascii="Times New Roman" w:hAnsi="Times New Roman" w:cs="Times New Roman"/>
+        </w:rPr>
+        <w:t xml:space="preserve"> </w:t>
+      </w:r>
+      <w:proofErr w:type="spellStart"/>
+      <w:r>
+        <w:rPr>
+          <w:rFonts w:ascii="Times New Roman" w:hAnsi="Times New Roman" w:cs="Times New Roman"/>
+        </w:rPr>
+        <w:t>săvârșirea</w:t>
+      </w:r>
+      <w:proofErr w:type="spellEnd"/>
+      <w:r>
+        <w:rPr>
+          <w:rFonts w:ascii="Times New Roman" w:hAnsi="Times New Roman" w:cs="Times New Roman"/>
+        </w:rPr>
+        <w:t xml:space="preserve"> </w:t>
+      </w:r>
+      <w:proofErr w:type="spellStart"/>
+      <w:r>
+        <w:rPr>
+          <w:rFonts w:ascii="Times New Roman" w:hAnsi="Times New Roman" w:cs="Times New Roman"/>
+        </w:rPr>
+        <w:t>infracțiunii</w:t>
+      </w:r>
+      <w:proofErr w:type="spellEnd"/>
+      <w:r>
+        <w:rPr>
+          <w:rFonts w:ascii="Times New Roman" w:hAnsi="Times New Roman" w:cs="Times New Roman"/>
+        </w:rPr>
+        <w:t xml:space="preserve"> de </w:t>
       </w:r>
       <w:proofErr w:type="gramStart"/>
       <w:r>
         <w:rPr>
           <w:rFonts w:ascii="Times New Roman" w:hAnsi="Times New Roman" w:cs="Times New Roman"/>
+          <w:b/>
+          <w:bCs/>
         </w:rPr>
         <w:t xml:space="preserve">{{ </w:t>
       </w:r>
@@ -243,13 +865,17 @@
       <w:r>
         <w:rPr>
           <w:rFonts w:ascii="Times New Roman" w:hAnsi="Times New Roman" w:cs="Times New Roman"/>
-        </w:rPr>
-        <w:t>numar</w:t>
+          <w:b/>
+          <w:bCs/>
+        </w:rPr>
+        <w:t>incadrare</w:t>
       </w:r>
       <w:proofErr w:type="gramEnd"/>
       <w:r>
         <w:rPr>
           <w:rFonts w:ascii="Times New Roman" w:hAnsi="Times New Roman" w:cs="Times New Roman"/>
+          <w:b/>
+          <w:bCs/>
         </w:rPr>
         <w:t>_</w:t>
       </w:r>
@@ -257,21 +883,150 @@
       <w:r>
         <w:rPr>
           <w:rFonts w:ascii="Times New Roman" w:hAnsi="Times New Roman" w:cs="Times New Roman"/>
-        </w:rPr>
-        <w:t>dosar</w:t>
-      </w:r>
-      <w:proofErr w:type="spellEnd"/>
-      <w:r>
-        <w:rPr>
-          <w:rFonts w:ascii="Times New Roman" w:hAnsi="Times New Roman" w:cs="Times New Roman"/>
-        </w:rPr>
-        <w:t xml:space="preserve"> }}...</w:t>
+          <w:b/>
+          <w:bCs/>
+        </w:rPr>
+        <w:t>juridica</w:t>
+      </w:r>
+      <w:proofErr w:type="spellEnd"/>
+      <w:r>
+        <w:rPr>
+          <w:rFonts w:ascii="Times New Roman" w:hAnsi="Times New Roman" w:cs="Times New Roman"/>
+          <w:b/>
+          <w:bCs/>
+        </w:rPr>
+        <w:t xml:space="preserve"> }</w:t>
       </w:r>
       <w:proofErr w:type="gramEnd"/>
+      <w:r>
+        <w:rPr>
+          <w:rFonts w:ascii="Times New Roman" w:hAnsi="Times New Roman" w:cs="Times New Roman"/>
+          <w:b/>
+          <w:bCs/>
+        </w:rPr>
+        <w:t>}</w:t>
+      </w:r>
+      <w:r>
+        <w:rPr>
+          <w:rFonts w:ascii="Times New Roman" w:hAnsi="Times New Roman" w:cs="Times New Roman"/>
+        </w:rPr>
+        <w:t xml:space="preserve">, </w:t>
+      </w:r>
+      <w:proofErr w:type="spellStart"/>
+      <w:r>
+        <w:rPr>
+          <w:rFonts w:ascii="Times New Roman" w:hAnsi="Times New Roman" w:cs="Times New Roman"/>
+        </w:rPr>
+        <w:t>prevăzută</w:t>
+      </w:r>
+      <w:proofErr w:type="spellEnd"/>
+      <w:r>
+        <w:rPr>
+          <w:rFonts w:ascii="Times New Roman" w:hAnsi="Times New Roman" w:cs="Times New Roman"/>
+        </w:rPr>
+        <w:t xml:space="preserve"> de </w:t>
+      </w:r>
+      <w:r>
+        <w:rPr>
+          <w:rFonts w:ascii="Times New Roman" w:hAnsi="Times New Roman" w:cs="Times New Roman"/>
+          <w:b/>
+          <w:bCs/>
+        </w:rPr>
+        <w:t xml:space="preserve">art. </w:t>
+      </w:r>
+      <w:proofErr w:type="gramStart"/>
+      <w:r>
+        <w:rPr>
+          <w:rFonts w:ascii="Times New Roman" w:hAnsi="Times New Roman" w:cs="Times New Roman"/>
+          <w:b/>
+          <w:bCs/>
+        </w:rPr>
+        <w:t xml:space="preserve">{{ </w:t>
+      </w:r>
+      <w:proofErr w:type="spellStart"/>
+      <w:r>
+        <w:rPr>
+          <w:rFonts w:ascii="Times New Roman" w:hAnsi="Times New Roman" w:cs="Times New Roman"/>
+          <w:b/>
+          <w:bCs/>
+        </w:rPr>
+        <w:t>articol</w:t>
+      </w:r>
+      <w:proofErr w:type="spellEnd"/>
+      <w:proofErr w:type="gramEnd"/>
+      <w:r>
+        <w:rPr>
+          <w:rFonts w:ascii="Times New Roman" w:hAnsi="Times New Roman" w:cs="Times New Roman"/>
+          <w:b/>
+          <w:bCs/>
+        </w:rPr>
+        <w:t xml:space="preserve"> }} din </w:t>
+      </w:r>
+      <w:proofErr w:type="gramStart"/>
+      <w:r>
+        <w:rPr>
+          <w:rFonts w:ascii="Times New Roman" w:hAnsi="Times New Roman" w:cs="Times New Roman"/>
+          <w:b/>
+          <w:bCs/>
+        </w:rPr>
+        <w:t xml:space="preserve">{{ </w:t>
+      </w:r>
+      <w:proofErr w:type="spellStart"/>
+      <w:r>
+        <w:rPr>
+          <w:rFonts w:ascii="Times New Roman" w:hAnsi="Times New Roman" w:cs="Times New Roman"/>
+          <w:b/>
+          <w:bCs/>
+        </w:rPr>
+        <w:t>act</w:t>
+      </w:r>
+      <w:proofErr w:type="gramEnd"/>
+      <w:r>
+        <w:rPr>
+          <w:rFonts w:ascii="Times New Roman" w:hAnsi="Times New Roman" w:cs="Times New Roman"/>
+          <w:b/>
+          <w:bCs/>
+        </w:rPr>
+        <w:t>_</w:t>
+      </w:r>
+      <w:proofErr w:type="gramStart"/>
+      <w:r>
+        <w:rPr>
+          <w:rFonts w:ascii="Times New Roman" w:hAnsi="Times New Roman" w:cs="Times New Roman"/>
+          <w:b/>
+          <w:bCs/>
+        </w:rPr>
+        <w:t>normativ</w:t>
+      </w:r>
+      <w:proofErr w:type="spellEnd"/>
+      <w:r>
+        <w:rPr>
+          <w:rFonts w:ascii="Times New Roman" w:hAnsi="Times New Roman" w:cs="Times New Roman"/>
+          <w:b/>
+          <w:bCs/>
+        </w:rPr>
+        <w:t xml:space="preserve"> }</w:t>
+      </w:r>
+      <w:proofErr w:type="gramEnd"/>
+      <w:r>
+        <w:rPr>
+          <w:rFonts w:ascii="Times New Roman" w:hAnsi="Times New Roman" w:cs="Times New Roman"/>
+          <w:b/>
+          <w:bCs/>
+        </w:rPr>
+        <w:t>}</w:t>
+      </w:r>
+      <w:r>
+        <w:rPr>
+          <w:rFonts w:ascii="Times New Roman" w:hAnsi="Times New Roman" w:cs="Times New Roman"/>
+        </w:rPr>
+        <w:t>.</w:t>
+      </w:r>
     </w:p>
     <w:p>
       <w:pPr>
         <w:ind w:firstLine="720"/>
+        <w:jc w:val="both"/>
         <w:rPr>
           <w:rFonts w:ascii="Times New Roman" w:hAnsi="Times New Roman" w:cs="Times New Roman"/>
           <w:b/>
@@ -282,53 +1037,770 @@
       <w:r>
         <w:rPr>
           <w:rFonts w:ascii="Times New Roman" w:hAnsi="Times New Roman" w:cs="Times New Roman"/>
-          <w:b/>
-          <w:bCs/>
-        </w:rPr>
-        <w:t>Numitul</w:t>
-      </w:r>
-      <w:proofErr w:type="spellEnd"/>
-      <w:r>
-        <w:rPr>
-          <w:rFonts w:ascii="Times New Roman" w:hAnsi="Times New Roman" w:cs="Times New Roman"/>
-          <w:b/>
-          <w:bCs/>
-        </w:rPr>
-        <w:t xml:space="preserve"> </w:t>
-      </w:r>
+        </w:rPr>
+        <w:t>Inculpatul</w:t>
+      </w:r>
+      <w:proofErr w:type="spellEnd"/>
+      <w:r>
+        <w:rPr>
+          <w:rFonts w:ascii="Times New Roman" w:hAnsi="Times New Roman" w:cs="Times New Roman"/>
+        </w:rPr>
+        <w:t>/</w:t>
+      </w:r>
+      <w:proofErr w:type="spellStart"/>
+      <w:r>
+        <w:rPr>
+          <w:rFonts w:ascii="Times New Roman" w:hAnsi="Times New Roman" w:cs="Times New Roman"/>
+        </w:rPr>
+        <w:t>partea</w:t>
+      </w:r>
+      <w:proofErr w:type="spellEnd"/>
+      <w:r>
+        <w:rPr>
+          <w:rFonts w:ascii="Times New Roman" w:hAnsi="Times New Roman" w:cs="Times New Roman"/>
+        </w:rPr>
+        <w:t>/</w:t>
+      </w:r>
+      <w:proofErr w:type="spellStart"/>
+      <w:r>
+        <w:rPr>
+          <w:rFonts w:ascii="Times New Roman" w:hAnsi="Times New Roman" w:cs="Times New Roman"/>
+        </w:rPr>
+        <w:t>suspectul</w:t>
+      </w:r>
+      <w:proofErr w:type="spellEnd"/>
+      <w:r>
+        <w:rPr>
+          <w:rFonts w:ascii="Times New Roman" w:hAnsi="Times New Roman" w:cs="Times New Roman"/>
+        </w:rPr>
+        <w:t xml:space="preserve">/ </w:t>
+      </w:r>
+      <w:proofErr w:type="spellStart"/>
+      <w:r>
+        <w:rPr>
+          <w:rFonts w:ascii="Times New Roman" w:hAnsi="Times New Roman" w:cs="Times New Roman"/>
+        </w:rPr>
+        <w:t>persoana</w:t>
+      </w:r>
+      <w:proofErr w:type="spellEnd"/>
+      <w:r>
+        <w:rPr>
+          <w:rFonts w:ascii="Times New Roman" w:hAnsi="Times New Roman" w:cs="Times New Roman"/>
+        </w:rPr>
+        <w:t xml:space="preserve"> </w:t>
+      </w:r>
+      <w:proofErr w:type="spellStart"/>
+      <w:r>
+        <w:rPr>
+          <w:rFonts w:ascii="Times New Roman" w:hAnsi="Times New Roman" w:cs="Times New Roman"/>
+        </w:rPr>
+        <w:t>vătămată</w:t>
+      </w:r>
+      <w:proofErr w:type="spellEnd"/>
+      <w:r>
+        <w:rPr>
+          <w:rFonts w:ascii="Times New Roman" w:hAnsi="Times New Roman" w:cs="Times New Roman"/>
+        </w:rPr>
+        <w:t xml:space="preserve">, </w:t>
+      </w:r>
+      <w:proofErr w:type="spellStart"/>
+      <w:r>
+        <w:rPr>
+          <w:rFonts w:ascii="Times New Roman" w:hAnsi="Times New Roman" w:cs="Times New Roman"/>
+        </w:rPr>
+        <w:t>citat</w:t>
+      </w:r>
+      <w:proofErr w:type="spellEnd"/>
+      <w:r>
+        <w:rPr>
+          <w:rFonts w:ascii="Times New Roman" w:hAnsi="Times New Roman" w:cs="Times New Roman"/>
+        </w:rPr>
+        <w:t>/</w:t>
+      </w:r>
+      <w:proofErr w:type="spellStart"/>
+      <w:r>
+        <w:rPr>
+          <w:rFonts w:ascii="Times New Roman" w:hAnsi="Times New Roman" w:cs="Times New Roman"/>
+        </w:rPr>
+        <w:t>citată</w:t>
+      </w:r>
+      <w:proofErr w:type="spellEnd"/>
+      <w:r>
+        <w:rPr>
+          <w:rFonts w:ascii="Times New Roman" w:hAnsi="Times New Roman" w:cs="Times New Roman"/>
+        </w:rPr>
+        <w:t xml:space="preserve">, are </w:t>
+      </w:r>
+      <w:proofErr w:type="spellStart"/>
+      <w:r>
+        <w:rPr>
+          <w:rFonts w:ascii="Times New Roman" w:hAnsi="Times New Roman" w:cs="Times New Roman"/>
+        </w:rPr>
+        <w:t>dreptul</w:t>
+      </w:r>
+      <w:proofErr w:type="spellEnd"/>
+      <w:r>
+        <w:rPr>
+          <w:rFonts w:ascii="Times New Roman" w:hAnsi="Times New Roman" w:cs="Times New Roman"/>
+        </w:rPr>
+        <w:t xml:space="preserve"> la un avocat cu care </w:t>
+      </w:r>
+      <w:proofErr w:type="spellStart"/>
+      <w:r>
+        <w:rPr>
+          <w:rFonts w:ascii="Times New Roman" w:hAnsi="Times New Roman" w:cs="Times New Roman"/>
+        </w:rPr>
+        <w:t>să</w:t>
+      </w:r>
+      <w:proofErr w:type="spellEnd"/>
+      <w:r>
+        <w:rPr>
+          <w:rFonts w:ascii="Times New Roman" w:hAnsi="Times New Roman" w:cs="Times New Roman"/>
+        </w:rPr>
+        <w:t xml:space="preserve"> se </w:t>
+      </w:r>
+      <w:proofErr w:type="spellStart"/>
+      <w:r>
+        <w:rPr>
+          <w:rFonts w:ascii="Times New Roman" w:hAnsi="Times New Roman" w:cs="Times New Roman"/>
+        </w:rPr>
+        <w:t>prezinte</w:t>
+      </w:r>
+      <w:proofErr w:type="spellEnd"/>
+      <w:r>
+        <w:rPr>
+          <w:rFonts w:ascii="Times New Roman" w:hAnsi="Times New Roman" w:cs="Times New Roman"/>
+        </w:rPr>
+        <w:t xml:space="preserve"> la </w:t>
+      </w:r>
+      <w:proofErr w:type="spellStart"/>
+      <w:r>
+        <w:rPr>
+          <w:rFonts w:ascii="Times New Roman" w:hAnsi="Times New Roman" w:cs="Times New Roman"/>
+        </w:rPr>
+        <w:t>termenul</w:t>
+      </w:r>
+      <w:proofErr w:type="spellEnd"/>
+      <w:r>
+        <w:rPr>
+          <w:rFonts w:ascii="Times New Roman" w:hAnsi="Times New Roman" w:cs="Times New Roman"/>
+        </w:rPr>
+        <w:t xml:space="preserve"> </w:t>
+      </w:r>
+      <w:proofErr w:type="spellStart"/>
+      <w:r>
+        <w:rPr>
+          <w:rFonts w:ascii="Times New Roman" w:hAnsi="Times New Roman" w:cs="Times New Roman"/>
+        </w:rPr>
+        <w:t>fixat</w:t>
+      </w:r>
+      <w:proofErr w:type="spellEnd"/>
+      <w:r>
+        <w:rPr>
+          <w:rFonts w:ascii="Times New Roman" w:hAnsi="Times New Roman" w:cs="Times New Roman"/>
+        </w:rPr>
+        <w:t xml:space="preserve">. </w:t>
+      </w:r>
+      <w:proofErr w:type="spellStart"/>
+      <w:r>
+        <w:rPr>
+          <w:rFonts w:ascii="Times New Roman" w:hAnsi="Times New Roman" w:cs="Times New Roman"/>
+        </w:rPr>
+        <w:t>În</w:t>
+      </w:r>
+      <w:proofErr w:type="spellEnd"/>
+      <w:r>
+        <w:rPr>
+          <w:rFonts w:ascii="Times New Roman" w:hAnsi="Times New Roman" w:cs="Times New Roman"/>
+        </w:rPr>
+        <w:t xml:space="preserve"> </w:t>
+      </w:r>
+      <w:proofErr w:type="spellStart"/>
+      <w:r>
+        <w:rPr>
+          <w:rFonts w:ascii="Times New Roman" w:hAnsi="Times New Roman" w:cs="Times New Roman"/>
+        </w:rPr>
+        <w:t>cazurile</w:t>
+      </w:r>
+      <w:proofErr w:type="spellEnd"/>
+      <w:r>
+        <w:rPr>
+          <w:rFonts w:ascii="Times New Roman" w:hAnsi="Times New Roman" w:cs="Times New Roman"/>
+        </w:rPr>
+        <w:t xml:space="preserve"> </w:t>
+      </w:r>
+      <w:proofErr w:type="spellStart"/>
+      <w:r>
+        <w:rPr>
+          <w:rFonts w:ascii="Times New Roman" w:hAnsi="Times New Roman" w:cs="Times New Roman"/>
+        </w:rPr>
+        <w:t>prevăzute</w:t>
+      </w:r>
+      <w:proofErr w:type="spellEnd"/>
+      <w:r>
+        <w:rPr>
+          <w:rFonts w:ascii="Times New Roman" w:hAnsi="Times New Roman" w:cs="Times New Roman"/>
+        </w:rPr>
+        <w:t xml:space="preserve"> de art. 90 </w:t>
+      </w:r>
+      <w:proofErr w:type="spellStart"/>
+      <w:r>
+        <w:rPr>
+          <w:rFonts w:ascii="Times New Roman" w:hAnsi="Times New Roman" w:cs="Times New Roman"/>
+        </w:rPr>
+        <w:t>şi</w:t>
+      </w:r>
+      <w:proofErr w:type="spellEnd"/>
+      <w:r>
+        <w:rPr>
+          <w:rFonts w:ascii="Times New Roman" w:hAnsi="Times New Roman" w:cs="Times New Roman"/>
+        </w:rPr>
+        <w:t xml:space="preserve"> art.93 </w:t>
+      </w:r>
+      <w:proofErr w:type="spellStart"/>
       <w:proofErr w:type="gramStart"/>
       <w:r>
         <w:rPr>
           <w:rFonts w:ascii="Times New Roman" w:hAnsi="Times New Roman" w:cs="Times New Roman"/>
-          <w:b/>
-          <w:bCs/>
-        </w:rPr>
-        <w:t xml:space="preserve">{{ </w:t>
-      </w:r>
-      <w:proofErr w:type="spellStart"/>
-      <w:r>
-        <w:rPr>
-          <w:rFonts w:ascii="Times New Roman" w:hAnsi="Times New Roman" w:cs="Times New Roman"/>
-          <w:b/>
-          <w:bCs/>
-        </w:rPr>
-        <w:t>nume</w:t>
+        </w:rPr>
+        <w:t>alin</w:t>
+      </w:r>
+      <w:proofErr w:type="spellEnd"/>
+      <w:r>
+        <w:rPr>
+          <w:rFonts w:ascii="Times New Roman" w:hAnsi="Times New Roman" w:cs="Times New Roman"/>
+        </w:rPr>
+        <w:t>.(</w:t>
       </w:r>
       <w:proofErr w:type="gramEnd"/>
       <w:r>
         <w:rPr>
           <w:rFonts w:ascii="Times New Roman" w:hAnsi="Times New Roman" w:cs="Times New Roman"/>
-          <w:b/>
-          <w:bCs/>
-        </w:rPr>
-        <w:t>_</w:t>
+        </w:rPr>
+        <w:t xml:space="preserve">4) Cod </w:t>
+      </w:r>
+      <w:proofErr w:type="spellStart"/>
+      <w:r>
+        <w:rPr>
+          <w:rFonts w:ascii="Times New Roman" w:hAnsi="Times New Roman" w:cs="Times New Roman"/>
+        </w:rPr>
+        <w:t>procedură</w:t>
+      </w:r>
+      <w:proofErr w:type="spellEnd"/>
+      <w:r>
+        <w:rPr>
+          <w:rFonts w:ascii="Times New Roman" w:hAnsi="Times New Roman" w:cs="Times New Roman"/>
+        </w:rPr>
+        <w:t xml:space="preserve"> </w:t>
+      </w:r>
+      <w:proofErr w:type="spellStart"/>
+      <w:r>
+        <w:rPr>
+          <w:rFonts w:ascii="Times New Roman" w:hAnsi="Times New Roman" w:cs="Times New Roman"/>
+        </w:rPr>
+        <w:t>penală</w:t>
+      </w:r>
+      <w:proofErr w:type="spellEnd"/>
+      <w:r>
+        <w:rPr>
+          <w:rFonts w:ascii="Times New Roman" w:hAnsi="Times New Roman" w:cs="Times New Roman"/>
+        </w:rPr>
+        <w:t xml:space="preserve">, </w:t>
+      </w:r>
+      <w:proofErr w:type="spellStart"/>
+      <w:r>
+        <w:rPr>
+          <w:rFonts w:ascii="Times New Roman" w:hAnsi="Times New Roman" w:cs="Times New Roman"/>
+        </w:rPr>
+        <w:t>asistenţa</w:t>
+      </w:r>
+      <w:proofErr w:type="spellEnd"/>
+      <w:r>
+        <w:rPr>
+          <w:rFonts w:ascii="Times New Roman" w:hAnsi="Times New Roman" w:cs="Times New Roman"/>
+        </w:rPr>
+        <w:t xml:space="preserve"> </w:t>
+      </w:r>
+      <w:proofErr w:type="spellStart"/>
+      <w:r>
+        <w:rPr>
+          <w:rFonts w:ascii="Times New Roman" w:hAnsi="Times New Roman" w:cs="Times New Roman"/>
+        </w:rPr>
+        <w:t>juridică</w:t>
+      </w:r>
+      <w:proofErr w:type="spellEnd"/>
+      <w:r>
+        <w:rPr>
+          <w:rFonts w:ascii="Times New Roman" w:hAnsi="Times New Roman" w:cs="Times New Roman"/>
+        </w:rPr>
+        <w:t xml:space="preserve"> </w:t>
+      </w:r>
+      <w:proofErr w:type="spellStart"/>
+      <w:r>
+        <w:rPr>
+          <w:rFonts w:ascii="Times New Roman" w:hAnsi="Times New Roman" w:cs="Times New Roman"/>
+        </w:rPr>
+        <w:t>este</w:t>
+      </w:r>
+      <w:proofErr w:type="spellEnd"/>
+      <w:r>
+        <w:rPr>
+          <w:rFonts w:ascii="Times New Roman" w:hAnsi="Times New Roman" w:cs="Times New Roman"/>
+        </w:rPr>
+        <w:t xml:space="preserve"> </w:t>
+      </w:r>
+      <w:proofErr w:type="spellStart"/>
+      <w:r>
+        <w:rPr>
+          <w:rFonts w:ascii="Times New Roman" w:hAnsi="Times New Roman" w:cs="Times New Roman"/>
+        </w:rPr>
+        <w:t>obligatorie</w:t>
+      </w:r>
+      <w:proofErr w:type="spellEnd"/>
+      <w:r>
+        <w:rPr>
+          <w:rFonts w:ascii="Times New Roman" w:hAnsi="Times New Roman" w:cs="Times New Roman"/>
+        </w:rPr>
+        <w:t xml:space="preserve">, </w:t>
+      </w:r>
+      <w:proofErr w:type="spellStart"/>
+      <w:r>
+        <w:rPr>
+          <w:rFonts w:ascii="Times New Roman" w:hAnsi="Times New Roman" w:cs="Times New Roman"/>
+        </w:rPr>
+        <w:t>iar</w:t>
+      </w:r>
+      <w:proofErr w:type="spellEnd"/>
+      <w:r>
+        <w:rPr>
+          <w:rFonts w:ascii="Times New Roman" w:hAnsi="Times New Roman" w:cs="Times New Roman"/>
+        </w:rPr>
+        <w:t xml:space="preserve"> </w:t>
+      </w:r>
+      <w:proofErr w:type="spellStart"/>
+      <w:r>
+        <w:rPr>
+          <w:rFonts w:ascii="Times New Roman" w:hAnsi="Times New Roman" w:cs="Times New Roman"/>
+        </w:rPr>
+        <w:t>în</w:t>
+      </w:r>
+      <w:proofErr w:type="spellEnd"/>
+      <w:r>
+        <w:rPr>
+          <w:rFonts w:ascii="Times New Roman" w:hAnsi="Times New Roman" w:cs="Times New Roman"/>
+        </w:rPr>
+        <w:t xml:space="preserve"> </w:t>
+      </w:r>
+      <w:proofErr w:type="spellStart"/>
+      <w:r>
+        <w:rPr>
+          <w:rFonts w:ascii="Times New Roman" w:hAnsi="Times New Roman" w:cs="Times New Roman"/>
+        </w:rPr>
+        <w:t>cazul</w:t>
+      </w:r>
+      <w:proofErr w:type="spellEnd"/>
+      <w:r>
+        <w:rPr>
+          <w:rFonts w:ascii="Times New Roman" w:hAnsi="Times New Roman" w:cs="Times New Roman"/>
+        </w:rPr>
+        <w:t xml:space="preserve"> </w:t>
+      </w:r>
+      <w:proofErr w:type="spellStart"/>
+      <w:r>
+        <w:rPr>
+          <w:rFonts w:ascii="Times New Roman" w:hAnsi="Times New Roman" w:cs="Times New Roman"/>
+        </w:rPr>
+        <w:t>în</w:t>
+      </w:r>
+      <w:proofErr w:type="spellEnd"/>
+      <w:r>
+        <w:rPr>
+          <w:rFonts w:ascii="Times New Roman" w:hAnsi="Times New Roman" w:cs="Times New Roman"/>
+        </w:rPr>
+        <w:t xml:space="preserve"> care </w:t>
+      </w:r>
+      <w:proofErr w:type="spellStart"/>
+      <w:r>
+        <w:rPr>
+          <w:rFonts w:ascii="Times New Roman" w:hAnsi="Times New Roman" w:cs="Times New Roman"/>
+        </w:rPr>
+        <w:t>apărarea</w:t>
+      </w:r>
+      <w:proofErr w:type="spellEnd"/>
+      <w:r>
+        <w:rPr>
+          <w:rFonts w:ascii="Times New Roman" w:hAnsi="Times New Roman" w:cs="Times New Roman"/>
+        </w:rPr>
+        <w:t xml:space="preserve"> </w:t>
+      </w:r>
+      <w:proofErr w:type="spellStart"/>
+      <w:r>
+        <w:rPr>
+          <w:rFonts w:ascii="Times New Roman" w:hAnsi="Times New Roman" w:cs="Times New Roman"/>
+        </w:rPr>
+        <w:t>este</w:t>
+      </w:r>
+      <w:proofErr w:type="spellEnd"/>
+      <w:r>
+        <w:rPr>
+          <w:rFonts w:ascii="Times New Roman" w:hAnsi="Times New Roman" w:cs="Times New Roman"/>
+        </w:rPr>
+        <w:t xml:space="preserve"> </w:t>
+      </w:r>
+      <w:proofErr w:type="spellStart"/>
+      <w:r>
+        <w:rPr>
+          <w:rFonts w:ascii="Times New Roman" w:hAnsi="Times New Roman" w:cs="Times New Roman"/>
+        </w:rPr>
+        <w:t>obligatorie</w:t>
+      </w:r>
+      <w:proofErr w:type="spellEnd"/>
+      <w:r>
+        <w:rPr>
+          <w:rFonts w:ascii="Times New Roman" w:hAnsi="Times New Roman" w:cs="Times New Roman"/>
+        </w:rPr>
+        <w:t xml:space="preserve">, </w:t>
+      </w:r>
+      <w:proofErr w:type="spellStart"/>
+      <w:r>
+        <w:rPr>
+          <w:rFonts w:ascii="Times New Roman" w:hAnsi="Times New Roman" w:cs="Times New Roman"/>
+        </w:rPr>
+        <w:t>iar</w:t>
+      </w:r>
+      <w:proofErr w:type="spellEnd"/>
+      <w:r>
+        <w:rPr>
+          <w:rFonts w:ascii="Times New Roman" w:hAnsi="Times New Roman" w:cs="Times New Roman"/>
+        </w:rPr>
+        <w:t xml:space="preserve"> </w:t>
+      </w:r>
+      <w:proofErr w:type="spellStart"/>
+      <w:r>
+        <w:rPr>
+          <w:rFonts w:ascii="Times New Roman" w:hAnsi="Times New Roman" w:cs="Times New Roman"/>
+        </w:rPr>
+        <w:t>în</w:t>
+      </w:r>
+      <w:proofErr w:type="spellEnd"/>
+      <w:r>
+        <w:rPr>
+          <w:rFonts w:ascii="Times New Roman" w:hAnsi="Times New Roman" w:cs="Times New Roman"/>
+        </w:rPr>
+        <w:t xml:space="preserve"> </w:t>
+      </w:r>
+      <w:proofErr w:type="spellStart"/>
+      <w:r>
+        <w:rPr>
+          <w:rFonts w:ascii="Times New Roman" w:hAnsi="Times New Roman" w:cs="Times New Roman"/>
+        </w:rPr>
+        <w:t>cazul</w:t>
+      </w:r>
+      <w:proofErr w:type="spellEnd"/>
+      <w:r>
+        <w:rPr>
+          <w:rFonts w:ascii="Times New Roman" w:hAnsi="Times New Roman" w:cs="Times New Roman"/>
+        </w:rPr>
+        <w:t xml:space="preserve"> </w:t>
+      </w:r>
+      <w:proofErr w:type="spellStart"/>
+      <w:r>
+        <w:rPr>
+          <w:rFonts w:ascii="Times New Roman" w:hAnsi="Times New Roman" w:cs="Times New Roman"/>
+        </w:rPr>
+        <w:t>în</w:t>
+      </w:r>
+      <w:proofErr w:type="spellEnd"/>
+      <w:r>
+        <w:rPr>
+          <w:rFonts w:ascii="Times New Roman" w:hAnsi="Times New Roman" w:cs="Times New Roman"/>
+        </w:rPr>
+        <w:t xml:space="preserve"> care </w:t>
+      </w:r>
+      <w:proofErr w:type="spellStart"/>
+      <w:r>
+        <w:rPr>
+          <w:rFonts w:ascii="Times New Roman" w:hAnsi="Times New Roman" w:cs="Times New Roman"/>
+        </w:rPr>
+        <w:t>suspectul</w:t>
+      </w:r>
+      <w:proofErr w:type="spellEnd"/>
+      <w:r>
+        <w:rPr>
+          <w:rFonts w:ascii="Times New Roman" w:hAnsi="Times New Roman" w:cs="Times New Roman"/>
+        </w:rPr>
+        <w:t xml:space="preserve">/ </w:t>
+      </w:r>
+      <w:proofErr w:type="spellStart"/>
+      <w:r>
+        <w:rPr>
+          <w:rFonts w:ascii="Times New Roman" w:hAnsi="Times New Roman" w:cs="Times New Roman"/>
+        </w:rPr>
+        <w:t>inculpatul</w:t>
+      </w:r>
+      <w:proofErr w:type="spellEnd"/>
+      <w:r>
+        <w:rPr>
+          <w:rFonts w:ascii="Times New Roman" w:hAnsi="Times New Roman" w:cs="Times New Roman"/>
+        </w:rPr>
+        <w:t xml:space="preserve">/ </w:t>
+      </w:r>
+      <w:proofErr w:type="spellStart"/>
+      <w:r>
+        <w:rPr>
+          <w:rFonts w:ascii="Times New Roman" w:hAnsi="Times New Roman" w:cs="Times New Roman"/>
+        </w:rPr>
+        <w:t>persoana</w:t>
+      </w:r>
+      <w:proofErr w:type="spellEnd"/>
+      <w:r>
+        <w:rPr>
+          <w:rFonts w:ascii="Times New Roman" w:hAnsi="Times New Roman" w:cs="Times New Roman"/>
+        </w:rPr>
+        <w:t xml:space="preserve"> </w:t>
+      </w:r>
+      <w:proofErr w:type="spellStart"/>
+      <w:r>
+        <w:rPr>
+          <w:rFonts w:ascii="Times New Roman" w:hAnsi="Times New Roman" w:cs="Times New Roman"/>
+        </w:rPr>
+        <w:t>vătămată</w:t>
+      </w:r>
+      <w:proofErr w:type="spellEnd"/>
+      <w:r>
+        <w:rPr>
+          <w:rFonts w:ascii="Times New Roman" w:hAnsi="Times New Roman" w:cs="Times New Roman"/>
+        </w:rPr>
+        <w:t xml:space="preserve">/ </w:t>
+      </w:r>
+      <w:proofErr w:type="spellStart"/>
+      <w:r>
+        <w:rPr>
+          <w:rFonts w:ascii="Times New Roman" w:hAnsi="Times New Roman" w:cs="Times New Roman"/>
+        </w:rPr>
+        <w:t>partea</w:t>
+      </w:r>
+      <w:proofErr w:type="spellEnd"/>
+      <w:r>
+        <w:rPr>
+          <w:rFonts w:ascii="Times New Roman" w:hAnsi="Times New Roman" w:cs="Times New Roman"/>
+        </w:rPr>
+        <w:t xml:space="preserve"> </w:t>
+      </w:r>
+      <w:proofErr w:type="spellStart"/>
+      <w:r>
+        <w:rPr>
+          <w:rFonts w:ascii="Times New Roman" w:hAnsi="Times New Roman" w:cs="Times New Roman"/>
+        </w:rPr>
+        <w:t>civilă</w:t>
+      </w:r>
+      <w:proofErr w:type="spellEnd"/>
+      <w:r>
+        <w:rPr>
+          <w:rFonts w:ascii="Times New Roman" w:hAnsi="Times New Roman" w:cs="Times New Roman"/>
+        </w:rPr>
+        <w:t xml:space="preserve"> nu </w:t>
+      </w:r>
+      <w:proofErr w:type="spellStart"/>
+      <w:r>
+        <w:rPr>
+          <w:rFonts w:ascii="Times New Roman" w:hAnsi="Times New Roman" w:cs="Times New Roman"/>
+        </w:rPr>
+        <w:t>şi</w:t>
+      </w:r>
+      <w:proofErr w:type="spellEnd"/>
+      <w:r>
+        <w:rPr>
+          <w:rFonts w:ascii="Times New Roman" w:hAnsi="Times New Roman" w:cs="Times New Roman"/>
+        </w:rPr>
+        <w:t>-a ales un avocat</w:t>
       </w:r>
       <w:proofErr w:type="gramStart"/>
       <w:r>
         <w:rPr>
           <w:rFonts w:ascii="Times New Roman" w:hAnsi="Times New Roman" w:cs="Times New Roman"/>
-          <w:b/>
-          <w:bCs/>
+        </w:rPr>
+        <w:t>, ,</w:t>
+      </w:r>
+      <w:proofErr w:type="gramEnd"/>
+      <w:r>
+        <w:rPr>
+          <w:rFonts w:ascii="Times New Roman" w:hAnsi="Times New Roman" w:cs="Times New Roman"/>
+        </w:rPr>
+        <w:t xml:space="preserve"> </w:t>
+      </w:r>
+      <w:proofErr w:type="spellStart"/>
+      <w:r>
+        <w:rPr>
+          <w:rFonts w:ascii="Times New Roman" w:hAnsi="Times New Roman" w:cs="Times New Roman"/>
+        </w:rPr>
+        <w:t>i</w:t>
+      </w:r>
+      <w:proofErr w:type="spellEnd"/>
+      <w:r>
+        <w:rPr>
+          <w:rFonts w:ascii="Times New Roman" w:hAnsi="Times New Roman" w:cs="Times New Roman"/>
+        </w:rPr>
+        <w:t xml:space="preserve"> se </w:t>
+      </w:r>
+      <w:proofErr w:type="spellStart"/>
+      <w:r>
+        <w:rPr>
+          <w:rFonts w:ascii="Times New Roman" w:hAnsi="Times New Roman" w:cs="Times New Roman"/>
+        </w:rPr>
+        <w:t>va</w:t>
+      </w:r>
+      <w:proofErr w:type="spellEnd"/>
+      <w:r>
+        <w:rPr>
+          <w:rFonts w:ascii="Times New Roman" w:hAnsi="Times New Roman" w:cs="Times New Roman"/>
+        </w:rPr>
+        <w:t xml:space="preserve"> </w:t>
+      </w:r>
+      <w:proofErr w:type="spellStart"/>
+      <w:r>
+        <w:rPr>
+          <w:rFonts w:ascii="Times New Roman" w:hAnsi="Times New Roman" w:cs="Times New Roman"/>
+        </w:rPr>
+        <w:t>desemna</w:t>
+      </w:r>
+      <w:proofErr w:type="spellEnd"/>
+      <w:r>
+        <w:rPr>
+          <w:rFonts w:ascii="Times New Roman" w:hAnsi="Times New Roman" w:cs="Times New Roman"/>
+        </w:rPr>
+        <w:t xml:space="preserve"> un avocat din </w:t>
+      </w:r>
+      <w:proofErr w:type="spellStart"/>
+      <w:r>
+        <w:rPr>
+          <w:rFonts w:ascii="Times New Roman" w:hAnsi="Times New Roman" w:cs="Times New Roman"/>
+        </w:rPr>
+        <w:t>oficiu</w:t>
+      </w:r>
+      <w:proofErr w:type="spellEnd"/>
+      <w:r>
+        <w:rPr>
+          <w:rFonts w:ascii="Times New Roman" w:hAnsi="Times New Roman" w:cs="Times New Roman"/>
+        </w:rPr>
+        <w:t xml:space="preserve">. </w:t>
+      </w:r>
+      <w:proofErr w:type="spellStart"/>
+      <w:r>
+        <w:rPr>
+          <w:rFonts w:ascii="Times New Roman" w:hAnsi="Times New Roman" w:cs="Times New Roman"/>
+        </w:rPr>
+        <w:t>În</w:t>
+      </w:r>
+      <w:proofErr w:type="spellEnd"/>
+      <w:r>
+        <w:rPr>
+          <w:rFonts w:ascii="Times New Roman" w:hAnsi="Times New Roman" w:cs="Times New Roman"/>
+        </w:rPr>
+        <w:t xml:space="preserve"> </w:t>
+      </w:r>
+      <w:proofErr w:type="spellStart"/>
+      <w:r>
+        <w:rPr>
+          <w:rFonts w:ascii="Times New Roman" w:hAnsi="Times New Roman" w:cs="Times New Roman"/>
+        </w:rPr>
+        <w:t>vederea</w:t>
+      </w:r>
+      <w:proofErr w:type="spellEnd"/>
+      <w:r>
+        <w:rPr>
+          <w:rFonts w:ascii="Times New Roman" w:hAnsi="Times New Roman" w:cs="Times New Roman"/>
+        </w:rPr>
+        <w:t xml:space="preserve"> </w:t>
+      </w:r>
+      <w:proofErr w:type="spellStart"/>
+      <w:r>
+        <w:rPr>
+          <w:rFonts w:ascii="Times New Roman" w:hAnsi="Times New Roman" w:cs="Times New Roman"/>
+        </w:rPr>
+        <w:t>exercitării</w:t>
+      </w:r>
+      <w:proofErr w:type="spellEnd"/>
+      <w:r>
+        <w:rPr>
+          <w:rFonts w:ascii="Times New Roman" w:hAnsi="Times New Roman" w:cs="Times New Roman"/>
+        </w:rPr>
+        <w:t xml:space="preserve"> </w:t>
+      </w:r>
+      <w:proofErr w:type="spellStart"/>
+      <w:r>
+        <w:rPr>
+          <w:rFonts w:ascii="Times New Roman" w:hAnsi="Times New Roman" w:cs="Times New Roman"/>
+        </w:rPr>
+        <w:t>dreptului</w:t>
+      </w:r>
+      <w:proofErr w:type="spellEnd"/>
+      <w:r>
+        <w:rPr>
+          <w:rFonts w:ascii="Times New Roman" w:hAnsi="Times New Roman" w:cs="Times New Roman"/>
+        </w:rPr>
+        <w:t xml:space="preserve"> la </w:t>
+      </w:r>
+      <w:proofErr w:type="spellStart"/>
+      <w:r>
+        <w:rPr>
+          <w:rFonts w:ascii="Times New Roman" w:hAnsi="Times New Roman" w:cs="Times New Roman"/>
+        </w:rPr>
+        <w:t>apărare</w:t>
+      </w:r>
+      <w:proofErr w:type="spellEnd"/>
+      <w:r>
+        <w:rPr>
+          <w:rFonts w:ascii="Times New Roman" w:hAnsi="Times New Roman" w:cs="Times New Roman"/>
+        </w:rPr>
+        <w:t xml:space="preserve">, </w:t>
+      </w:r>
+      <w:proofErr w:type="spellStart"/>
+      <w:r>
+        <w:rPr>
+          <w:rFonts w:ascii="Times New Roman" w:hAnsi="Times New Roman" w:cs="Times New Roman"/>
+        </w:rPr>
+        <w:t>inculpatul</w:t>
+      </w:r>
+      <w:proofErr w:type="spellEnd"/>
+      <w:r>
+        <w:rPr>
+          <w:rFonts w:ascii="Times New Roman" w:hAnsi="Times New Roman" w:cs="Times New Roman"/>
+        </w:rPr>
+        <w:t>/</w:t>
+      </w:r>
+      <w:proofErr w:type="spellStart"/>
+      <w:r>
+        <w:rPr>
+          <w:rFonts w:ascii="Times New Roman" w:hAnsi="Times New Roman" w:cs="Times New Roman"/>
+        </w:rPr>
+        <w:t>suspectul</w:t>
+      </w:r>
+      <w:proofErr w:type="spellEnd"/>
+      <w:r>
+        <w:rPr>
+          <w:rFonts w:ascii="Times New Roman" w:hAnsi="Times New Roman" w:cs="Times New Roman"/>
+        </w:rPr>
+        <w:t>/</w:t>
+      </w:r>
+      <w:proofErr w:type="spellStart"/>
+      <w:r>
+        <w:rPr>
+          <w:rFonts w:ascii="Times New Roman" w:hAnsi="Times New Roman" w:cs="Times New Roman"/>
+        </w:rPr>
+        <w:t>partea</w:t>
+      </w:r>
+      <w:proofErr w:type="spellEnd"/>
+      <w:r>
+        <w:rPr>
+          <w:rFonts w:ascii="Times New Roman" w:hAnsi="Times New Roman" w:cs="Times New Roman"/>
+        </w:rPr>
+        <w:t xml:space="preserve"> /</w:t>
+      </w:r>
+      <w:proofErr w:type="spellStart"/>
+      <w:r>
+        <w:rPr>
+          <w:rFonts w:ascii="Times New Roman" w:hAnsi="Times New Roman" w:cs="Times New Roman"/>
         </w:rPr>
         <w:t>persoana</w:t>
       </w:r>
@@ -336,44 +1808,153 @@
       <w:r>
         <w:rPr>
           <w:rFonts w:ascii="Times New Roman" w:hAnsi="Times New Roman" w:cs="Times New Roman"/>
-          <w:b/>
-          <w:bCs/>
-        </w:rPr>
-        <w:t xml:space="preserve"> }</w:t>
-      </w:r>
-      <w:proofErr w:type="gramEnd"/>
-      <w:r>
-        <w:rPr>
-          <w:rFonts w:ascii="Times New Roman" w:hAnsi="Times New Roman" w:cs="Times New Roman"/>
-          <w:b/>
-          <w:bCs/>
-        </w:rPr>
-        <w:t xml:space="preserve">}, cu </w:t>
-      </w:r>
-      <w:proofErr w:type="spellStart"/>
-      <w:r>
-        <w:rPr>
-          <w:rFonts w:ascii="Times New Roman" w:hAnsi="Times New Roman" w:cs="Times New Roman"/>
-          <w:b/>
-          <w:bCs/>
-        </w:rPr>
-        <w:t>domiciliul</w:t>
-      </w:r>
-      <w:proofErr w:type="spellEnd"/>
-      <w:r>
-        <w:rPr>
-          <w:rFonts w:ascii="Times New Roman" w:hAnsi="Times New Roman" w:cs="Times New Roman"/>
-          <w:b/>
-          <w:bCs/>
-        </w:rPr>
-        <w:t xml:space="preserve"> </w:t>
-      </w:r>
-      <w:proofErr w:type="spellStart"/>
-      <w:r>
-        <w:rPr>
-          <w:rFonts w:ascii="Times New Roman" w:hAnsi="Times New Roman" w:cs="Times New Roman"/>
-          <w:b/>
-          <w:bCs/>
+        </w:rPr>
+        <w:t xml:space="preserve"> </w:t>
+      </w:r>
+      <w:proofErr w:type="spellStart"/>
+      <w:r>
+        <w:rPr>
+          <w:rFonts w:ascii="Times New Roman" w:hAnsi="Times New Roman" w:cs="Times New Roman"/>
+        </w:rPr>
+        <w:t>vătămată</w:t>
+      </w:r>
+      <w:proofErr w:type="spellEnd"/>
+      <w:r>
+        <w:rPr>
+          <w:rFonts w:ascii="Times New Roman" w:hAnsi="Times New Roman" w:cs="Times New Roman"/>
+        </w:rPr>
+        <w:t xml:space="preserve">, </w:t>
+      </w:r>
+      <w:proofErr w:type="spellStart"/>
+      <w:r>
+        <w:rPr>
+          <w:rFonts w:ascii="Times New Roman" w:hAnsi="Times New Roman" w:cs="Times New Roman"/>
+        </w:rPr>
+        <w:t>poate</w:t>
+      </w:r>
+      <w:proofErr w:type="spellEnd"/>
+      <w:r>
+        <w:rPr>
+          <w:rFonts w:ascii="Times New Roman" w:hAnsi="Times New Roman" w:cs="Times New Roman"/>
+        </w:rPr>
+        <w:t xml:space="preserve"> consulta </w:t>
+      </w:r>
+      <w:proofErr w:type="spellStart"/>
+      <w:r>
+        <w:rPr>
+          <w:rFonts w:ascii="Times New Roman" w:hAnsi="Times New Roman" w:cs="Times New Roman"/>
+        </w:rPr>
+        <w:t>dosarul</w:t>
+      </w:r>
+      <w:proofErr w:type="spellEnd"/>
+      <w:r>
+        <w:rPr>
+          <w:rFonts w:ascii="Times New Roman" w:hAnsi="Times New Roman" w:cs="Times New Roman"/>
+        </w:rPr>
+        <w:t xml:space="preserve">. </w:t>
+      </w:r>
+      <w:proofErr w:type="spellStart"/>
+      <w:r>
+        <w:rPr>
+          <w:rFonts w:ascii="Times New Roman" w:hAnsi="Times New Roman" w:cs="Times New Roman"/>
+        </w:rPr>
+        <w:t>În</w:t>
+      </w:r>
+      <w:proofErr w:type="spellEnd"/>
+      <w:r>
+        <w:rPr>
+          <w:rFonts w:ascii="Times New Roman" w:hAnsi="Times New Roman" w:cs="Times New Roman"/>
+        </w:rPr>
+        <w:t xml:space="preserve"> </w:t>
+      </w:r>
+      <w:proofErr w:type="spellStart"/>
+      <w:r>
+        <w:rPr>
+          <w:rFonts w:ascii="Times New Roman" w:hAnsi="Times New Roman" w:cs="Times New Roman"/>
+        </w:rPr>
+        <w:t>caz</w:t>
+      </w:r>
+      <w:proofErr w:type="spellEnd"/>
+      <w:r>
+        <w:rPr>
+          <w:rFonts w:ascii="Times New Roman" w:hAnsi="Times New Roman" w:cs="Times New Roman"/>
+        </w:rPr>
+        <w:t xml:space="preserve"> de </w:t>
+      </w:r>
+      <w:proofErr w:type="spellStart"/>
+      <w:r>
+        <w:rPr>
+          <w:rFonts w:ascii="Times New Roman" w:hAnsi="Times New Roman" w:cs="Times New Roman"/>
+        </w:rPr>
+        <w:t>neprezentare</w:t>
+      </w:r>
+      <w:proofErr w:type="spellEnd"/>
+      <w:r>
+        <w:rPr>
+          <w:rFonts w:ascii="Times New Roman" w:hAnsi="Times New Roman" w:cs="Times New Roman"/>
+        </w:rPr>
+        <w:t xml:space="preserve"> </w:t>
+      </w:r>
+      <w:proofErr w:type="spellStart"/>
+      <w:r>
+        <w:rPr>
+          <w:rFonts w:ascii="Times New Roman" w:hAnsi="Times New Roman" w:cs="Times New Roman"/>
+        </w:rPr>
+        <w:t>nejustificată</w:t>
+      </w:r>
+      <w:proofErr w:type="spellEnd"/>
+      <w:r>
+        <w:rPr>
+          <w:rFonts w:ascii="Times New Roman" w:hAnsi="Times New Roman" w:cs="Times New Roman"/>
+        </w:rPr>
+        <w:t xml:space="preserve"> se </w:t>
+      </w:r>
+      <w:proofErr w:type="spellStart"/>
+      <w:r>
+        <w:rPr>
+          <w:rFonts w:ascii="Times New Roman" w:hAnsi="Times New Roman" w:cs="Times New Roman"/>
+        </w:rPr>
+        <w:t>poate</w:t>
+      </w:r>
+      <w:proofErr w:type="spellEnd"/>
+      <w:r>
+        <w:rPr>
+          <w:rFonts w:ascii="Times New Roman" w:hAnsi="Times New Roman" w:cs="Times New Roman"/>
+        </w:rPr>
+        <w:t xml:space="preserve"> </w:t>
+      </w:r>
+      <w:proofErr w:type="spellStart"/>
+      <w:r>
+        <w:rPr>
+          <w:rFonts w:ascii="Times New Roman" w:hAnsi="Times New Roman" w:cs="Times New Roman"/>
+        </w:rPr>
+        <w:t>dispune</w:t>
+      </w:r>
+      <w:proofErr w:type="spellEnd"/>
+      <w:r>
+        <w:rPr>
+          <w:rFonts w:ascii="Times New Roman" w:hAnsi="Times New Roman" w:cs="Times New Roman"/>
+        </w:rPr>
+        <w:t xml:space="preserve"> </w:t>
+      </w:r>
+      <w:proofErr w:type="spellStart"/>
+      <w:r>
+        <w:rPr>
+          <w:rFonts w:ascii="Times New Roman" w:hAnsi="Times New Roman" w:cs="Times New Roman"/>
+        </w:rPr>
+        <w:t>aducerea</w:t>
+      </w:r>
+      <w:proofErr w:type="spellEnd"/>
+      <w:r>
+        <w:rPr>
+          <w:rFonts w:ascii="Times New Roman" w:hAnsi="Times New Roman" w:cs="Times New Roman"/>
+        </w:rPr>
+        <w:t xml:space="preserve"> </w:t>
+      </w:r>
+      <w:proofErr w:type="spellStart"/>
+      <w:r>
+        <w:rPr>
+          <w:rFonts w:ascii="Times New Roman" w:hAnsi="Times New Roman" w:cs="Times New Roman"/>
         </w:rPr>
         <w:t>în</w:t>
       </w:r>
@@ -381,492 +1962,227 @@
       <w:r>
         <w:rPr>
           <w:rFonts w:ascii="Times New Roman" w:hAnsi="Times New Roman" w:cs="Times New Roman"/>
-          <w:b/>
-          <w:bCs/>
-        </w:rPr>
-        <w:t xml:space="preserve"> </w:t>
-      </w:r>
-      <w:proofErr w:type="gramStart"/>
-      <w:r>
-        <w:rPr>
-          <w:rFonts w:ascii="Times New Roman" w:hAnsi="Times New Roman" w:cs="Times New Roman"/>
-          <w:b/>
-          <w:bCs/>
-        </w:rPr>
-        <w:t xml:space="preserve">{{ </w:t>
-      </w:r>
-      <w:proofErr w:type="spellStart"/>
-      <w:r>
-        <w:rPr>
-          <w:rFonts w:ascii="Times New Roman" w:hAnsi="Times New Roman" w:cs="Times New Roman"/>
-          <w:b/>
-          <w:bCs/>
-        </w:rPr>
-        <w:t>adresa</w:t>
-      </w:r>
-      <w:proofErr w:type="spellEnd"/>
-      <w:proofErr w:type="gramEnd"/>
-      <w:r>
-        <w:rPr>
-          <w:rFonts w:ascii="Times New Roman" w:hAnsi="Times New Roman" w:cs="Times New Roman"/>
-          <w:b/>
-          <w:bCs/>
-        </w:rPr>
-        <w:t xml:space="preserve"> }} </w:t>
-      </w:r>
-      <w:proofErr w:type="spellStart"/>
-      <w:r>
-        <w:rPr>
-          <w:rFonts w:ascii="Times New Roman" w:hAnsi="Times New Roman" w:cs="Times New Roman"/>
-          <w:b/>
-          <w:bCs/>
-        </w:rPr>
-        <w:t>este</w:t>
-      </w:r>
-      <w:proofErr w:type="spellEnd"/>
-      <w:r>
-        <w:rPr>
-          <w:rFonts w:ascii="Times New Roman" w:hAnsi="Times New Roman" w:cs="Times New Roman"/>
-          <w:b/>
-          <w:bCs/>
-        </w:rPr>
-        <w:t xml:space="preserve"> </w:t>
-      </w:r>
-      <w:proofErr w:type="spellStart"/>
-      <w:r>
-        <w:rPr>
-          <w:rFonts w:ascii="Times New Roman" w:hAnsi="Times New Roman" w:cs="Times New Roman"/>
-          <w:b/>
-          <w:bCs/>
-        </w:rPr>
-        <w:t>citat</w:t>
-      </w:r>
-      <w:proofErr w:type="spellEnd"/>
-      <w:r>
-        <w:rPr>
-          <w:rFonts w:ascii="Times New Roman" w:hAnsi="Times New Roman" w:cs="Times New Roman"/>
-          <w:b/>
-          <w:bCs/>
-        </w:rPr>
-        <w:t xml:space="preserve"> </w:t>
-      </w:r>
-      <w:proofErr w:type="spellStart"/>
-      <w:r>
-        <w:rPr>
-          <w:rFonts w:ascii="Times New Roman" w:hAnsi="Times New Roman" w:cs="Times New Roman"/>
-          <w:b/>
-          <w:bCs/>
-        </w:rPr>
-        <w:t>în</w:t>
-      </w:r>
-      <w:proofErr w:type="spellEnd"/>
-      <w:r>
-        <w:rPr>
-          <w:rFonts w:ascii="Times New Roman" w:hAnsi="Times New Roman" w:cs="Times New Roman"/>
-          <w:b/>
-          <w:bCs/>
-        </w:rPr>
-        <w:t xml:space="preserve"> data de </w:t>
-      </w:r>
-      <w:proofErr w:type="gramStart"/>
-      <w:r>
-        <w:rPr>
-          <w:rFonts w:ascii="Times New Roman" w:hAnsi="Times New Roman" w:cs="Times New Roman"/>
-          <w:b/>
-          <w:bCs/>
-        </w:rPr>
-        <w:t xml:space="preserve">{{ </w:t>
-      </w:r>
-      <w:proofErr w:type="spellStart"/>
-      <w:r>
-        <w:rPr>
-          <w:rFonts w:ascii="Times New Roman" w:hAnsi="Times New Roman" w:cs="Times New Roman"/>
-          <w:b/>
-          <w:bCs/>
-        </w:rPr>
-        <w:t>data</w:t>
-      </w:r>
-      <w:proofErr w:type="gramEnd"/>
-      <w:r>
-        <w:rPr>
-          <w:rFonts w:ascii="Times New Roman" w:hAnsi="Times New Roman" w:cs="Times New Roman"/>
-          <w:b/>
-          <w:bCs/>
-        </w:rPr>
-        <w:t>_</w:t>
-      </w:r>
-      <w:proofErr w:type="gramStart"/>
-      <w:r>
-        <w:rPr>
-          <w:rFonts w:ascii="Times New Roman" w:hAnsi="Times New Roman" w:cs="Times New Roman"/>
-          <w:b/>
-          <w:bCs/>
-        </w:rPr>
-        <w:t>ora</w:t>
-      </w:r>
-      <w:proofErr w:type="spellEnd"/>
-      <w:r>
-        <w:rPr>
-          <w:rFonts w:ascii="Times New Roman" w:hAnsi="Times New Roman" w:cs="Times New Roman"/>
-          <w:b/>
-          <w:bCs/>
-        </w:rPr>
-        <w:t xml:space="preserve"> }</w:t>
-      </w:r>
-      <w:proofErr w:type="gramEnd"/>
-      <w:r>
-        <w:rPr>
-          <w:rFonts w:ascii="Times New Roman" w:hAnsi="Times New Roman" w:cs="Times New Roman"/>
-          <w:b/>
-          <w:bCs/>
-        </w:rPr>
-        <w:t xml:space="preserve">} </w:t>
-      </w:r>
-      <w:proofErr w:type="spellStart"/>
-      <w:r>
-        <w:rPr>
-          <w:rFonts w:ascii="Times New Roman" w:hAnsi="Times New Roman" w:cs="Times New Roman"/>
-          <w:b/>
-          <w:bCs/>
-        </w:rPr>
-        <w:t>în</w:t>
-      </w:r>
-      <w:proofErr w:type="spellEnd"/>
-      <w:r>
-        <w:rPr>
-          <w:rFonts w:ascii="Times New Roman" w:hAnsi="Times New Roman" w:cs="Times New Roman"/>
-          <w:b/>
-          <w:bCs/>
-        </w:rPr>
-        <w:t xml:space="preserve"> </w:t>
-      </w:r>
-      <w:proofErr w:type="spellStart"/>
-      <w:r>
-        <w:rPr>
-          <w:rFonts w:ascii="Times New Roman" w:hAnsi="Times New Roman" w:cs="Times New Roman"/>
-          <w:b/>
-          <w:bCs/>
-        </w:rPr>
-        <w:t>calitate</w:t>
-      </w:r>
-      <w:proofErr w:type="spellEnd"/>
-      <w:r>
-        <w:rPr>
-          <w:rFonts w:ascii="Times New Roman" w:hAnsi="Times New Roman" w:cs="Times New Roman"/>
-          <w:b/>
-          <w:bCs/>
+        </w:rPr>
+        <w:t xml:space="preserve"> </w:t>
+      </w:r>
+      <w:proofErr w:type="spellStart"/>
+      <w:r>
+        <w:rPr>
+          <w:rFonts w:ascii="Times New Roman" w:hAnsi="Times New Roman" w:cs="Times New Roman"/>
+        </w:rPr>
+        <w:t>baza</w:t>
+      </w:r>
+      <w:proofErr w:type="spellEnd"/>
+      <w:r>
+        <w:rPr>
+          <w:rFonts w:ascii="Times New Roman" w:hAnsi="Times New Roman" w:cs="Times New Roman"/>
+        </w:rPr>
+        <w:t xml:space="preserve"> </w:t>
+      </w:r>
+      <w:proofErr w:type="spellStart"/>
+      <w:r>
+        <w:rPr>
+          <w:rFonts w:ascii="Times New Roman" w:hAnsi="Times New Roman" w:cs="Times New Roman"/>
+        </w:rPr>
+        <w:t>unui</w:t>
+      </w:r>
+      <w:proofErr w:type="spellEnd"/>
+      <w:r>
+        <w:rPr>
+          <w:rFonts w:ascii="Times New Roman" w:hAnsi="Times New Roman" w:cs="Times New Roman"/>
+        </w:rPr>
+        <w:t xml:space="preserve"> </w:t>
+      </w:r>
+      <w:proofErr w:type="spellStart"/>
+      <w:r>
+        <w:rPr>
+          <w:rFonts w:ascii="Times New Roman" w:hAnsi="Times New Roman" w:cs="Times New Roman"/>
+        </w:rPr>
+        <w:t>mandat</w:t>
+      </w:r>
+      <w:proofErr w:type="spellEnd"/>
+      <w:r>
+        <w:rPr>
+          <w:rFonts w:ascii="Times New Roman" w:hAnsi="Times New Roman" w:cs="Times New Roman"/>
         </w:rPr>
         <w:t xml:space="preserve"> de </w:t>
       </w:r>
-      <w:proofErr w:type="gramStart"/>
-      <w:r>
-        <w:rPr>
-          <w:rFonts w:ascii="Times New Roman" w:hAnsi="Times New Roman" w:cs="Times New Roman"/>
-          <w:b/>
-          <w:bCs/>
-        </w:rPr>
-        <w:t xml:space="preserve">{{ </w:t>
-      </w:r>
-      <w:proofErr w:type="spellStart"/>
-      <w:r>
-        <w:rPr>
-          <w:rFonts w:ascii="Times New Roman" w:hAnsi="Times New Roman" w:cs="Times New Roman"/>
-          <w:b/>
-          <w:bCs/>
-        </w:rPr>
-        <w:t>calitate</w:t>
-      </w:r>
-      <w:proofErr w:type="spellEnd"/>
-      <w:proofErr w:type="gramEnd"/>
-      <w:r>
-        <w:rPr>
-          <w:rFonts w:ascii="Times New Roman" w:hAnsi="Times New Roman" w:cs="Times New Roman"/>
-          <w:b/>
-          <w:bCs/>
-        </w:rPr>
-        <w:t xml:space="preserve"> }}</w:t>
-      </w:r>
-    </w:p>
-    <w:p>
-      <w:pPr>
-        <w:ind w:firstLine="720"/>
-        <w:rPr>
-          <w:rFonts w:ascii="Times New Roman" w:hAnsi="Times New Roman" w:cs="Times New Roman"/>
-          <w:b/>
-          <w:bCs/>
-        </w:rPr>
-      </w:pPr>
-    </w:p>
-    <w:p>
-      <w:pPr>
-        <w:rPr>
-          <w:rFonts w:ascii="Times New Roman" w:hAnsi="Times New Roman" w:cs="Times New Roman"/>
-          <w:b/>
-          <w:bCs/>
-        </w:rPr>
-      </w:pPr>
-      <w:r>
-        <w:rPr>
-          <w:rFonts w:ascii="Times New Roman" w:hAnsi="Times New Roman" w:cs="Times New Roman"/>
-          <w:b/>
-          <w:bCs/>
-          <w:i/>
-          <w:iCs/>
-        </w:rPr>
-        <w:t xml:space="preserve">(... </w:t>
-      </w:r>
-      <w:proofErr w:type="spellStart"/>
-      <w:r>
-        <w:rPr>
-          <w:rFonts w:ascii="Times New Roman" w:hAnsi="Times New Roman" w:cs="Times New Roman"/>
-          <w:b/>
-          <w:bCs/>
-          <w:i/>
-          <w:iCs/>
-        </w:rPr>
-        <w:t>conținutul</w:t>
-      </w:r>
-      <w:proofErr w:type="spellEnd"/>
-      <w:r>
-        <w:rPr>
-          <w:rFonts w:ascii="Times New Roman" w:hAnsi="Times New Roman" w:cs="Times New Roman"/>
-          <w:b/>
-          <w:bCs/>
-          <w:i/>
-          <w:iCs/>
-        </w:rPr>
-        <w:t xml:space="preserve"> </w:t>
-      </w:r>
-      <w:proofErr w:type="spellStart"/>
-      <w:r>
-        <w:rPr>
-          <w:rFonts w:ascii="Times New Roman" w:hAnsi="Times New Roman" w:cs="Times New Roman"/>
-          <w:b/>
-          <w:bCs/>
-          <w:i/>
-          <w:iCs/>
-        </w:rPr>
-        <w:t>citației</w:t>
-      </w:r>
-      <w:proofErr w:type="spellEnd"/>
-      <w:r>
-        <w:rPr>
-          <w:rFonts w:ascii="Times New Roman" w:hAnsi="Times New Roman" w:cs="Times New Roman"/>
-          <w:b/>
-          <w:bCs/>
-          <w:i/>
-          <w:iCs/>
-        </w:rPr>
-        <w:t xml:space="preserve"> ...)</w:t>
-      </w:r>
-    </w:p>
-    <w:p>
-      <w:pPr>
-        <w:rPr>
-          <w:rFonts w:ascii="Times New Roman" w:hAnsi="Times New Roman" w:cs="Times New Roman"/>
-          <w:b/>
-          <w:bCs/>
-          <w:i/>
-          <w:iCs/>
-        </w:rPr>
-      </w:pPr>
-      <w:r>
-        <w:rPr>
-          <w:rFonts w:ascii="Times New Roman" w:hAnsi="Times New Roman" w:cs="Times New Roman"/>
-          <w:b/>
-          <w:bCs/>
-          <w:i/>
-          <w:iCs/>
-        </w:rPr>
-        <w:t xml:space="preserve">(... </w:t>
-      </w:r>
-      <w:proofErr w:type="spellStart"/>
-      <w:r>
-        <w:rPr>
-          <w:rFonts w:ascii="Times New Roman" w:hAnsi="Times New Roman" w:cs="Times New Roman"/>
-          <w:b/>
-          <w:bCs/>
-          <w:i/>
-          <w:iCs/>
-        </w:rPr>
-        <w:t>apeși</w:t>
-      </w:r>
-      <w:proofErr w:type="spellEnd"/>
-      <w:r>
-        <w:rPr>
-          <w:rFonts w:ascii="Times New Roman" w:hAnsi="Times New Roman" w:cs="Times New Roman"/>
-          <w:b/>
-          <w:bCs/>
-          <w:i/>
-          <w:iCs/>
-        </w:rPr>
-        <w:t xml:space="preserve"> Enter de </w:t>
-      </w:r>
-      <w:proofErr w:type="spellStart"/>
-      <w:r>
-        <w:rPr>
-          <w:rFonts w:ascii="Times New Roman" w:hAnsi="Times New Roman" w:cs="Times New Roman"/>
-          <w:b/>
-          <w:bCs/>
-          <w:i/>
-          <w:iCs/>
-        </w:rPr>
-        <w:t>câteva</w:t>
-      </w:r>
-      <w:proofErr w:type="spellEnd"/>
-      <w:r>
-        <w:rPr>
-          <w:rFonts w:ascii="Times New Roman" w:hAnsi="Times New Roman" w:cs="Times New Roman"/>
-          <w:b/>
-          <w:bCs/>
-          <w:i/>
-          <w:iCs/>
-        </w:rPr>
-        <w:t xml:space="preserve"> </w:t>
-      </w:r>
-      <w:proofErr w:type="spellStart"/>
-      <w:r>
-        <w:rPr>
-          <w:rFonts w:ascii="Times New Roman" w:hAnsi="Times New Roman" w:cs="Times New Roman"/>
-          <w:b/>
-          <w:bCs/>
-          <w:i/>
-          <w:iCs/>
-        </w:rPr>
-        <w:t>ori</w:t>
-      </w:r>
-      <w:proofErr w:type="spellEnd"/>
-      <w:r>
-        <w:rPr>
-          <w:rFonts w:ascii="Times New Roman" w:hAnsi="Times New Roman" w:cs="Times New Roman"/>
-          <w:b/>
-          <w:bCs/>
-          <w:i/>
-          <w:iCs/>
-        </w:rPr>
-        <w:t xml:space="preserve"> </w:t>
-      </w:r>
-      <w:proofErr w:type="spellStart"/>
-      <w:r>
-        <w:rPr>
-          <w:rFonts w:ascii="Times New Roman" w:hAnsi="Times New Roman" w:cs="Times New Roman"/>
-          <w:b/>
-          <w:bCs/>
-          <w:i/>
-          <w:iCs/>
-        </w:rPr>
-        <w:t>pentru</w:t>
-      </w:r>
-      <w:proofErr w:type="spellEnd"/>
-      <w:r>
-        <w:rPr>
-          <w:rFonts w:ascii="Times New Roman" w:hAnsi="Times New Roman" w:cs="Times New Roman"/>
-          <w:b/>
-          <w:bCs/>
-          <w:i/>
-          <w:iCs/>
-        </w:rPr>
-        <w:t xml:space="preserve"> </w:t>
-      </w:r>
-      <w:proofErr w:type="gramStart"/>
-      <w:r>
-        <w:rPr>
-          <w:rFonts w:ascii="Times New Roman" w:hAnsi="Times New Roman" w:cs="Times New Roman"/>
-          <w:b/>
-          <w:bCs/>
-          <w:i/>
-          <w:iCs/>
-        </w:rPr>
-        <w:t>a</w:t>
-      </w:r>
-      <w:proofErr w:type="gramEnd"/>
-      <w:r>
-        <w:rPr>
-          <w:rFonts w:ascii="Times New Roman" w:hAnsi="Times New Roman" w:cs="Times New Roman"/>
-          <w:b/>
-          <w:bCs/>
-          <w:i/>
-          <w:iCs/>
-        </w:rPr>
-        <w:t xml:space="preserve"> </w:t>
-      </w:r>
-      <w:proofErr w:type="spellStart"/>
-      <w:r>
-        <w:rPr>
-          <w:rFonts w:ascii="Times New Roman" w:hAnsi="Times New Roman" w:cs="Times New Roman"/>
-          <w:b/>
-          <w:bCs/>
-          <w:i/>
-          <w:iCs/>
-        </w:rPr>
-        <w:t>ajunge</w:t>
-      </w:r>
-      <w:proofErr w:type="spellEnd"/>
-      <w:r>
-        <w:rPr>
-          <w:rFonts w:ascii="Times New Roman" w:hAnsi="Times New Roman" w:cs="Times New Roman"/>
-          <w:b/>
-          <w:bCs/>
-          <w:i/>
-          <w:iCs/>
-        </w:rPr>
-        <w:t xml:space="preserve"> la </w:t>
-      </w:r>
-      <w:proofErr w:type="spellStart"/>
-      <w:r>
-        <w:rPr>
-          <w:rFonts w:ascii="Times New Roman" w:hAnsi="Times New Roman" w:cs="Times New Roman"/>
-          <w:b/>
-          <w:bCs/>
-          <w:i/>
-          <w:iCs/>
-        </w:rPr>
-        <w:t>subsolul</w:t>
-      </w:r>
-      <w:proofErr w:type="spellEnd"/>
-      <w:r>
-        <w:rPr>
-          <w:rFonts w:ascii="Times New Roman" w:hAnsi="Times New Roman" w:cs="Times New Roman"/>
-          <w:b/>
-          <w:bCs/>
-          <w:i/>
-          <w:iCs/>
-        </w:rPr>
-        <w:t xml:space="preserve"> </w:t>
-      </w:r>
-      <w:proofErr w:type="spellStart"/>
-      <w:r>
-        <w:rPr>
-          <w:rFonts w:ascii="Times New Roman" w:hAnsi="Times New Roman" w:cs="Times New Roman"/>
-          <w:b/>
-          <w:bCs/>
-          <w:i/>
-          <w:iCs/>
-        </w:rPr>
-        <w:t>paginii</w:t>
-      </w:r>
-      <w:proofErr w:type="spellEnd"/>
-      <w:r>
-        <w:rPr>
-          <w:rFonts w:ascii="Times New Roman" w:hAnsi="Times New Roman" w:cs="Times New Roman"/>
-          <w:b/>
-          <w:bCs/>
-          <w:i/>
-          <w:iCs/>
-        </w:rPr>
-        <w:t xml:space="preserve"> ...)</w:t>
-      </w:r>
-    </w:p>
-    <w:p>
-      <w:pPr>
-        <w:rPr>
-          <w:rFonts w:ascii="Times New Roman" w:hAnsi="Times New Roman" w:cs="Times New Roman"/>
-          <w:b/>
-          <w:bCs/>
-          <w:i/>
-          <w:iCs/>
-        </w:rPr>
-      </w:pPr>
+      <w:proofErr w:type="spellStart"/>
+      <w:r>
+        <w:rPr>
+          <w:rFonts w:ascii="Times New Roman" w:hAnsi="Times New Roman" w:cs="Times New Roman"/>
+        </w:rPr>
+        <w:t>aducere</w:t>
+      </w:r>
+      <w:proofErr w:type="spellEnd"/>
+      <w:r>
+        <w:rPr>
+          <w:rFonts w:ascii="Times New Roman" w:hAnsi="Times New Roman" w:cs="Times New Roman"/>
+        </w:rPr>
+        <w:t xml:space="preserve">. </w:t>
+      </w:r>
+      <w:proofErr w:type="spellStart"/>
+      <w:r>
+        <w:rPr>
+          <w:rFonts w:ascii="Times New Roman" w:hAnsi="Times New Roman" w:cs="Times New Roman"/>
+        </w:rPr>
+        <w:t>Totodată</w:t>
+      </w:r>
+      <w:proofErr w:type="spellEnd"/>
+      <w:r>
+        <w:rPr>
+          <w:rFonts w:ascii="Times New Roman" w:hAnsi="Times New Roman" w:cs="Times New Roman"/>
+        </w:rPr>
+        <w:t xml:space="preserve">, </w:t>
+      </w:r>
+      <w:proofErr w:type="spellStart"/>
+      <w:r>
+        <w:rPr>
+          <w:rFonts w:ascii="Times New Roman" w:hAnsi="Times New Roman" w:cs="Times New Roman"/>
+        </w:rPr>
+        <w:t>lipsa</w:t>
+      </w:r>
+      <w:proofErr w:type="spellEnd"/>
+      <w:r>
+        <w:rPr>
+          <w:rFonts w:ascii="Times New Roman" w:hAnsi="Times New Roman" w:cs="Times New Roman"/>
+        </w:rPr>
+        <w:t xml:space="preserve"> </w:t>
+      </w:r>
+      <w:proofErr w:type="spellStart"/>
+      <w:r>
+        <w:rPr>
+          <w:rFonts w:ascii="Times New Roman" w:hAnsi="Times New Roman" w:cs="Times New Roman"/>
+        </w:rPr>
+        <w:t>nejustificată</w:t>
+      </w:r>
+      <w:proofErr w:type="spellEnd"/>
+      <w:r>
+        <w:rPr>
+          <w:rFonts w:ascii="Times New Roman" w:hAnsi="Times New Roman" w:cs="Times New Roman"/>
+        </w:rPr>
+        <w:t xml:space="preserve"> a </w:t>
+      </w:r>
+      <w:proofErr w:type="spellStart"/>
+      <w:r>
+        <w:rPr>
+          <w:rFonts w:ascii="Times New Roman" w:hAnsi="Times New Roman" w:cs="Times New Roman"/>
+        </w:rPr>
+        <w:t>persoanei</w:t>
+      </w:r>
+      <w:proofErr w:type="spellEnd"/>
+      <w:r>
+        <w:rPr>
+          <w:rFonts w:ascii="Times New Roman" w:hAnsi="Times New Roman" w:cs="Times New Roman"/>
+        </w:rPr>
+        <w:t xml:space="preserve"> </w:t>
+      </w:r>
+      <w:proofErr w:type="spellStart"/>
+      <w:r>
+        <w:rPr>
+          <w:rFonts w:ascii="Times New Roman" w:hAnsi="Times New Roman" w:cs="Times New Roman"/>
+        </w:rPr>
+        <w:t>chemate</w:t>
+      </w:r>
+      <w:proofErr w:type="spellEnd"/>
+      <w:r>
+        <w:rPr>
+          <w:rFonts w:ascii="Times New Roman" w:hAnsi="Times New Roman" w:cs="Times New Roman"/>
+        </w:rPr>
+        <w:t xml:space="preserve"> </w:t>
+      </w:r>
+      <w:proofErr w:type="spellStart"/>
+      <w:r>
+        <w:rPr>
+          <w:rFonts w:ascii="Times New Roman" w:hAnsi="Times New Roman" w:cs="Times New Roman"/>
+        </w:rPr>
+        <w:t>să</w:t>
+      </w:r>
+      <w:proofErr w:type="spellEnd"/>
+      <w:r>
+        <w:rPr>
+          <w:rFonts w:ascii="Times New Roman" w:hAnsi="Times New Roman" w:cs="Times New Roman"/>
+        </w:rPr>
+        <w:t xml:space="preserve"> </w:t>
+      </w:r>
+      <w:proofErr w:type="spellStart"/>
+      <w:r>
+        <w:rPr>
+          <w:rFonts w:ascii="Times New Roman" w:hAnsi="Times New Roman" w:cs="Times New Roman"/>
+        </w:rPr>
+        <w:t>dea</w:t>
+      </w:r>
+      <w:proofErr w:type="spellEnd"/>
+      <w:r>
+        <w:rPr>
+          <w:rFonts w:ascii="Times New Roman" w:hAnsi="Times New Roman" w:cs="Times New Roman"/>
+        </w:rPr>
+        <w:t xml:space="preserve"> </w:t>
+      </w:r>
+      <w:proofErr w:type="spellStart"/>
+      <w:r>
+        <w:rPr>
+          <w:rFonts w:ascii="Times New Roman" w:hAnsi="Times New Roman" w:cs="Times New Roman"/>
+        </w:rPr>
+        <w:t>declaraţii</w:t>
+      </w:r>
+      <w:proofErr w:type="spellEnd"/>
+      <w:r>
+        <w:rPr>
+          <w:rFonts w:ascii="Times New Roman" w:hAnsi="Times New Roman" w:cs="Times New Roman"/>
+        </w:rPr>
+        <w:t xml:space="preserve">, </w:t>
+      </w:r>
+      <w:proofErr w:type="spellStart"/>
+      <w:r>
+        <w:rPr>
+          <w:rFonts w:ascii="Times New Roman" w:hAnsi="Times New Roman" w:cs="Times New Roman"/>
+        </w:rPr>
+        <w:t>sau</w:t>
+      </w:r>
+      <w:proofErr w:type="spellEnd"/>
+      <w:r>
+        <w:rPr>
+          <w:rFonts w:ascii="Times New Roman" w:hAnsi="Times New Roman" w:cs="Times New Roman"/>
+        </w:rPr>
+        <w:t xml:space="preserve"> </w:t>
+      </w:r>
+      <w:proofErr w:type="spellStart"/>
+      <w:r>
+        <w:rPr>
+          <w:rFonts w:ascii="Times New Roman" w:hAnsi="Times New Roman" w:cs="Times New Roman"/>
+        </w:rPr>
+        <w:t>părăsirea</w:t>
+      </w:r>
+      <w:proofErr w:type="spellEnd"/>
+      <w:r>
+        <w:rPr>
+          <w:rFonts w:ascii="Times New Roman" w:hAnsi="Times New Roman" w:cs="Times New Roman"/>
+        </w:rPr>
+        <w:t xml:space="preserve"> </w:t>
+      </w:r>
+      <w:proofErr w:type="spellStart"/>
+      <w:r>
+        <w:rPr>
+          <w:rFonts w:ascii="Times New Roman" w:hAnsi="Times New Roman" w:cs="Times New Roman"/>
+        </w:rPr>
+        <w:t>fără</w:t>
+      </w:r>
+      <w:proofErr w:type="spellEnd"/>
+      <w:r>
+        <w:rPr>
+          <w:rFonts w:ascii="Times New Roman" w:hAnsi="Times New Roman" w:cs="Times New Roman"/>
+        </w:rPr>
+        <w:t xml:space="preserve"> </w:t>
+      </w:r>
+      <w:proofErr w:type="spellStart"/>
+      <w:r>
+        <w:rPr>
+          <w:rFonts w:ascii="Times New Roman" w:hAnsi="Times New Roman" w:cs="Times New Roman"/>
+        </w:rPr>
+        <w:t>permisiune</w:t>
+      </w:r>
+      <w:proofErr w:type="spellEnd"/>
     </w:p>
     <w:p>
       <w:pPr>
@@ -903,7 +2219,7 @@
           <w:b/>
           <w:bCs/>
         </w:rPr>
-        <w:t>PROCUROR,</w:t>
+        <w:t>PROCUROR</w:t>
       </w:r>
     </w:p>
     <w:p>
@@ -972,6 +2288,7 @@
     </w:p>
     <w:p/>
     <w:sectPr>
+      <w:type w:val="continuous"/>
       <w:pgSz w:w="12240" w:h="15840"/>
       <w:pgMar w:top="1440" w:right="1440" w:bottom="1440" w:left="1440" w:header="720" w:footer="720" w:gutter="0"/>
       <w:cols w:space="720"/>
@@ -979,6 +2296,56 @@
     </w:sectPr>
   </w:body>
 </w:document>
+</file>
+
+<file path=word/endnotes.xml><?xml version="1.0" encoding="utf-8"?>
+<w:endnotes xmlns:wpc="http://schemas.microsoft.com/office/word/2010/wordprocessingCanvas" xmlns:cx="http://schemas.microsoft.com/office/drawing/2014/chartex" xmlns:cx1="http://schemas.microsoft.com/office/drawing/2015/9/8/chartex" xmlns:cx2="http://schemas.microsoft.com/office/drawing/2015/10/21/chartex" xmlns:cx3="http://schemas.microsoft.com/office/drawing/2016/5/9/chartex" xmlns:cx4="http://schemas.microsoft.com/office/drawing/2016/5/10/chartex" xmlns:cx5="http://schemas.microsoft.com/office/drawing/2016/5/11/chartex" xmlns:cx6="http://schemas.microsoft.com/office/drawing/2016/5/12/chartex" xmlns:cx7="http://schemas.microsoft.com/office/drawing/2016/5/13/chartex" xmlns:cx8="http://schemas.microsoft.com/office/drawing/2016/5/14/chartex" xmlns:mc="http://schemas.openxmlformats.org/markup-compatibility/2006" xmlns:aink="http://schemas.microsoft.com/office/drawing/2016/ink" xmlns:am3d="http://schemas.microsoft.com/office/drawing/2017/model3d" xmlns:o="urn:schemas-microsoft-com:office:office" xmlns:oel="http://schemas.microsoft.com/office/2019/extlst" xmlns:r="http://schemas.openxmlformats.org/officeDocument/2006/relationships" xmlns:m="http://schemas.openxmlformats.org/officeDocument/2006/math" xmlns:v="urn:schemas-microsoft-com:vml" xmlns:wp14="http://schemas.microsoft.com/office/word/2010/wordprocessingDrawing" xmlns:wp="http://schemas.openxmlformats.org/drawingml/2006/wordprocessingDrawing" xmlns:w10="urn:schemas-microsoft-com:office:word" xmlns:w="http://schemas.openxmlformats.org/wordprocessingml/2006/main" xmlns:w14="http://schemas.microsoft.com/office/word/2010/wordml" xmlns:w15="http://schemas.microsoft.com/office/word/2012/wordml" xmlns:w16cex="http://schemas.microsoft.com/office/word/2018/wordml/cex" xmlns:w16cid="http://schemas.microsoft.com/office/word/2016/wordml/cid" xmlns:w16="http://schemas.microsoft.com/office/word/2018/wordml" xmlns:w16du="http://schemas.microsoft.com/office/word/2023/wordml/word16du" xmlns:w16sdtdh="http://schemas.microsoft.com/office/word/2020/wordml/sdtdatahash" xmlns:w16sdtfl="http://schemas.microsoft.com/office/word/2024/wordml/sdtformatlock" xmlns:w16se="http://schemas.microsoft.com/office/word/2015/wordml/symex" xmlns:wpg="http://schemas.microsoft.com/office/word/2010/wordprocessingGroup" xmlns:wpi="http://schemas.microsoft.com/office/word/2010/wordprocessingInk" xmlns:wne="http://schemas.microsoft.com/office/word/2006/wordml" xmlns:wps="http://schemas.microsoft.com/office/word/2010/wordprocessingShape" mc:Ignorable="w14 w15 w16se w16cid w16 w16cex w16sdtdh w16sdtfl w16du wp14">
+  <w:endnote w:type="separator" w:id="-1">
+    <w:p>
+      <w:pPr>
+        <w:spacing w:after="0" w:line="240" w:lineRule="auto"/>
+      </w:pPr>
+      <w:r>
+        <w:separator/>
+      </w:r>
+    </w:p>
+  </w:endnote>
+  <w:endnote w:type="continuationSeparator" w:id="0">
+    <w:p>
+      <w:pPr>
+        <w:spacing w:after="0" w:line="240" w:lineRule="auto"/>
+      </w:pPr>
+      <w:r>
+        <w:continuationSeparator/>
+      </w:r>
+    </w:p>
+  </w:endnote>
+</w:endnotes>
+</file>
+
+<file path=word/footnotes.xml><?xml version="1.0" encoding="utf-8"?>
+<w:footnotes xmlns:wpc="http://schemas.microsoft.com/office/word/2010/wordprocessingCanvas" xmlns:cx="http://schemas.microsoft.com/office/drawing/2014/chartex" xmlns:cx1="http://schemas.microsoft.com/office/drawing/2015/9/8/chartex" xmlns:cx2="http://schemas.microsoft.com/office/drawing/2015/10/21/chartex" xmlns:cx3="http://schemas.microsoft.com/office/drawing/2016/5/9/chartex" xmlns:cx4="http://schemas.microsoft.com/office/drawing/2016/5/10/chartex" xmlns:cx5="http://schemas.microsoft.com/office/drawing/2016/5/11/chartex" xmlns:cx6="http://schemas.microsoft.com/office/drawing/2016/5/12/chartex" xmlns:cx7="http://schemas.microsoft.com/office/drawing/2016/5/13/chartex" xmlns:cx8="http://schemas.microsoft.com/office/drawing/2016/5/14/chartex" xmlns:mc="http://schemas.openxmlformats.org/markup-compatibility/2006" xmlns:aink="http://schemas.microsoft.com/office/drawing/2016/ink" xmlns:am3d="http://schemas.microsoft.com/office/drawing/2017/model3d" xmlns:o="urn:schemas-microsoft-com:office:office" xmlns:oel="http://schemas.microsoft.com/office/2019/extlst" xmlns:r="http://schemas.openxmlformats.org/officeDocument/2006/relationships" xmlns:m="http://schemas.openxmlformats.org/officeDocument/2006/math" xmlns:v="urn:schemas-microsoft-com:vml" xmlns:wp14="http://schemas.microsoft.com/office/word/2010/wordprocessingDrawing" xmlns:wp="http://schemas.openxmlformats.org/drawingml/2006/wordprocessingDrawing" xmlns:w10="urn:schemas-microsoft-com:office:word" xmlns:w="http://schemas.openxmlformats.org/wordprocessingml/2006/main" xmlns:w14="http://schemas.microsoft.com/office/word/2010/wordml" xmlns:w15="http://schemas.microsoft.com/office/word/2012/wordml" xmlns:w16cex="http://schemas.microsoft.com/office/word/2018/wordml/cex" xmlns:w16cid="http://schemas.microsoft.com/office/word/2016/wordml/cid" xmlns:w16="http://schemas.microsoft.com/office/word/2018/wordml" xmlns:w16du="http://schemas.microsoft.com/office/word/2023/wordml/word16du" xmlns:w16sdtdh="http://schemas.microsoft.com/office/word/2020/wordml/sdtdatahash" xmlns:w16sdtfl="http://schemas.microsoft.com/office/word/2024/wordml/sdtformatlock" xmlns:w16se="http://schemas.microsoft.com/office/word/2015/wordml/symex" xmlns:wpg="http://schemas.microsoft.com/office/word/2010/wordprocessingGroup" xmlns:wpi="http://schemas.microsoft.com/office/word/2010/wordprocessingInk" xmlns:wne="http://schemas.microsoft.com/office/word/2006/wordml" xmlns:wps="http://schemas.microsoft.com/office/word/2010/wordprocessingShape" mc:Ignorable="w14 w15 w16se w16cid w16 w16cex w16sdtdh w16sdtfl w16du wp14">
+  <w:footnote w:type="separator" w:id="-1">
+    <w:p>
+      <w:pPr>
+        <w:spacing w:after="0" w:line="240" w:lineRule="auto"/>
+      </w:pPr>
+      <w:r>
+        <w:separator/>
+      </w:r>
+    </w:p>
+  </w:footnote>
+  <w:footnote w:type="continuationSeparator" w:id="0">
+    <w:p>
+      <w:pPr>
+        <w:spacing w:after="0" w:line="240" w:lineRule="auto"/>
+      </w:pPr>
+      <w:r>
+        <w:continuationSeparator/>
+      </w:r>
+    </w:p>
+  </w:footnote>
+</w:footnotes>
 </file>
 
 <file path=word/styles.xml><?xml version="1.0" encoding="utf-8"?>
@@ -1381,6 +2748,7 @@
   <w:style w:type="paragraph" w:default="1" w:styleId="Normal">
     <w:name w:val="Normal"/>
     <w:qFormat/>
+    <w:rsid w:val="00903326"/>
   </w:style>
   <w:style w:type="paragraph" w:styleId="Heading1">
     <w:name w:val="heading 1"/>
@@ -1898,6 +3266,50 @@
       <w:spacing w:val="5"/>
     </w:rPr>
   </w:style>
+  <w:style w:type="paragraph" w:styleId="Header">
+    <w:name w:val="header"/>
+    <w:basedOn w:val="Normal"/>
+    <w:link w:val="HeaderChar"/>
+    <w:uiPriority w:val="99"/>
+    <w:unhideWhenUsed/>
+    <w:rsid w:val="00FA4E26"/>
+    <w:pPr>
+      <w:tabs>
+        <w:tab w:val="center" w:pos="4680"/>
+        <w:tab w:val="right" w:pos="9360"/>
+      </w:tabs>
+      <w:spacing w:after="0" w:line="240" w:lineRule="auto"/>
+    </w:pPr>
+  </w:style>
+  <w:style w:type="character" w:customStyle="1" w:styleId="HeaderChar">
+    <w:name w:val="Header Char"/>
+    <w:basedOn w:val="DefaultParagraphFont"/>
+    <w:link w:val="Header"/>
+    <w:uiPriority w:val="99"/>
+    <w:rsid w:val="00FA4E26"/>
+  </w:style>
+  <w:style w:type="paragraph" w:styleId="Footer">
+    <w:name w:val="footer"/>
+    <w:basedOn w:val="Normal"/>
+    <w:link w:val="FooterChar"/>
+    <w:uiPriority w:val="99"/>
+    <w:unhideWhenUsed/>
+    <w:rsid w:val="00FA4E26"/>
+    <w:pPr>
+      <w:tabs>
+        <w:tab w:val="center" w:pos="4680"/>
+        <w:tab w:val="right" w:pos="9360"/>
+      </w:tabs>
+      <w:spacing w:after="0" w:line="240" w:lineRule="auto"/>
+    </w:pPr>
+  </w:style>
+  <w:style w:type="character" w:customStyle="1" w:styleId="FooterChar">
+    <w:name w:val="Footer Char"/>
+    <w:basedOn w:val="DefaultParagraphFont"/>
+    <w:link w:val="Footer"/>
+    <w:uiPriority w:val="99"/>
+    <w:rsid w:val="00FA4E26"/>
+  </w:style>
 </w:styles>
 </file>
 

</xml_diff>